<commit_message>
Add ArcGIS Pro and QGIS screenshots to user guide
Add screenshots of the ArcGIS Pro ribbon, tool parameters, Add-In
Manager and Add Toolbox dialog, and of the QGIS plugin menu and
Install from ZIP page. Correct the toolbox path step: ArcGIS Pro's
Add Toolbox dialog does not expand %LOCALAPPDATA%, so the guide now
uses the full AppData path.

Co-Authored-By: Claude Opus 5.5 <noreply@anthropic.com>
</commit_message>
<xml_diff>
--- a/Suomenvaylat_kayttoohje.docx
+++ b/Suomenvaylat_kayttoohje.docx
@@ -545,14 +545,16 @@
     </w:p>
     <w:p>
       <w:pPr>
-        <w:spacing w:after="120"/>
+        <w:keepNext/>
+        <w:spacing w:before="120"/>
+        <w:jc w:val="center"/>
       </w:pPr>
       <w:r>
         <w:drawing>
           <wp:inline distT="0" distB="0" distL="0" distR="0">
-            <wp:extent cx="266700" cy="266700"/>
-            <wp:effectExtent t="0" r="0" b="0" l="0"/>
-            <wp:docPr id="1" name="icon" descr="Työkalun kuvake" title="Kuvake"/>
+            <wp:extent cx="4476750" cy="1123950"/>
+            <wp:effectExtent t="19050" r="19050" b="19050" l="19050"/>
+            <wp:docPr id="1" name="arc_ribbon.png" descr="Suomenväylät.fi-painike Add-In-välilehdellä." title="Suomenväylät.fi-painike Add-In-välilehdellä."/>
             <wp:cNvGraphicFramePr>
               <a:graphicFrameLocks xmlns:a="http://schemas.openxmlformats.org/drawingml/2006/main" noChangeAspect="1"/>
             </wp:cNvGraphicFramePr>
@@ -575,11 +577,17 @@
                   <pic:spPr bwMode="auto">
                     <a:xfrm>
                       <a:off x="0" y="0"/>
-                      <a:ext cx="266700" cy="266700"/>
+                      <a:ext cx="4476750" cy="1123950"/>
                     </a:xfrm>
                     <a:prstGeom prst="rect">
                       <a:avLst/>
                     </a:prstGeom>
+                    <a:noFill/>
+                    <a:ln>
+                      <a:solidFill>
+                        <a:srgbClr val="BFBFBF"/>
+                      </a:solidFill>
+                    </a:ln>
                   </pic:spPr>
                 </pic:pic>
               </a:graphicData>
@@ -587,21 +595,21 @@
           </wp:inline>
         </w:drawing>
       </w:r>
-      <w:r>
-        <w:t xml:space="preserve">  </w:t>
-      </w:r>
-      <w:r>
-        <w:t xml:space="preserve">Tämä kuvake avaa työkalun </w:t>
-      </w:r>
-      <w:r>
-        <w:rPr>
-          <w:b/>
-          <w:bCs/>
-        </w:rPr>
-        <w:t xml:space="preserve">Add-In</w:t>
-      </w:r>
-      <w:r>
-        <w:t xml:space="preserve">-välilehdeltä.</w:t>
+    </w:p>
+    <w:p>
+      <w:pPr>
+        <w:spacing w:after="200" w:before="60"/>
+        <w:jc w:val="center"/>
+      </w:pPr>
+      <w:r>
+        <w:rPr>
+          <w:i/>
+          <w:iCs/>
+          <w:color w:val="595959"/>
+          <w:sz w:val="18"/>
+          <w:szCs w:val="18"/>
+        </w:rPr>
+        <w:t xml:space="preserve">Kuva 1. Suomenväylät.fi-painike Add-In-välilehdellä.</w:t>
       </w:r>
     </w:p>
     <w:p>
@@ -622,7 +630,7 @@
         <w:t xml:space="preserve">Päivitys: </w:t>
       </w:r>
       <w:r>
-        <w:t xml:space="preserve">Asenna uusi .esriAddInX samalla tavalla ArcGIS Pro suljettuna. Uusi versio korvaa vanhan. Asennetut lisäosat löytyvät kohdasta </w:t>
+        <w:t xml:space="preserve">Asenna uusi .esriAddInX samalla tavalla ArcGIS Pro suljettuna. Uusi versio korvaa vanhan. Asennetun version näet kohdasta </w:t>
       </w:r>
       <w:r>
         <w:rPr>
@@ -632,1368 +640,31 @@
         <w:t xml:space="preserve">Project → Add-In Manager</w:t>
       </w:r>
       <w:r>
-        <w:t xml:space="preserve">, josta lisäosan voi myös poistaa.</w:t>
-      </w:r>
-    </w:p>
-    <w:p>
-      <w:pPr>
-        <w:pStyle w:val="Heading2"/>
+        <w:t xml:space="preserve">, josta lisäosan voi myös poistaa (</w:t>
+      </w:r>
+      <w:r>
+        <w:rPr>
+          <w:b/>
+          <w:bCs/>
+        </w:rPr>
+        <w:t xml:space="preserve">Delete this Add-In</w:t>
+      </w:r>
+      <w:r>
+        <w:t xml:space="preserve">).</w:t>
+      </w:r>
+    </w:p>
+    <w:p>
+      <w:pPr>
         <w:keepNext/>
-      </w:pPr>
-      <w:r>
-        <w:t xml:space="preserve">1.2  Aineistojen lataus: Suomenväylät.fi</w:t>
-      </w:r>
-    </w:p>
-    <w:p>
-      <w:pPr>
-        <w:pStyle w:val="ListParagraph"/>
-        <w:numPr>
-          <w:ilvl w:val="0"/>
-          <w:numId w:val="4"/>
-        </w:numPr>
-        <w:spacing w:after="80"/>
-      </w:pPr>
-      <w:r>
-        <w:t xml:space="preserve">Valitse </w:t>
-      </w:r>
-      <w:r>
-        <w:rPr>
-          <w:b/>
-          <w:bCs/>
-        </w:rPr>
-        <w:t xml:space="preserve">Add-In → Suomenväylät.fi</w:t>
-      </w:r>
-      <w:r>
-        <w:t xml:space="preserve">. Työkalu avautuu Geoprocessing-paneeliin.</w:t>
-      </w:r>
-    </w:p>
-    <w:p>
-      <w:pPr>
-        <w:pStyle w:val="ListParagraph"/>
-        <w:numPr>
-          <w:ilvl w:val="0"/>
-          <w:numId w:val="4"/>
-        </w:numPr>
-        <w:spacing w:after="80"/>
-      </w:pPr>
-      <w:r>
-        <w:rPr>
-          <w:b/>
-          <w:bCs/>
-        </w:rPr>
-        <w:t xml:space="preserve">Valitse rajapinnat:</w:t>
-      </w:r>
-      <w:r>
-        <w:t xml:space="preserve"> valitse yksi tai useampi lähde. Väylä on valittuna oletuksena.</w:t>
-      </w:r>
-    </w:p>
-    <w:p>
-      <w:pPr>
-        <w:pStyle w:val="ListParagraph"/>
-        <w:numPr>
-          <w:ilvl w:val="0"/>
-          <w:numId w:val="4"/>
-        </w:numPr>
-        <w:spacing w:after="80"/>
-      </w:pPr>
-      <w:r>
-        <w:t xml:space="preserve">Rajaa pitkää tasoluetteloa kentässä </w:t>
-      </w:r>
-      <w:r>
-        <w:rPr>
-          <w:b/>
-          <w:bCs/>
-        </w:rPr>
-        <w:t xml:space="preserve">Suodata tasoja kirjoittamalla</w:t>
-      </w:r>
-      <w:r>
-        <w:t xml:space="preserve">, esimerkiksi hakusanalla nopeus.</w:t>
-      </w:r>
-    </w:p>
-    <w:p>
-      <w:pPr>
-        <w:pStyle w:val="ListParagraph"/>
-        <w:numPr>
-          <w:ilvl w:val="0"/>
-          <w:numId w:val="4"/>
-        </w:numPr>
-        <w:spacing w:after="80"/>
-      </w:pPr>
-      <w:r>
-        <w:rPr>
-          <w:b/>
-          <w:bCs/>
-        </w:rPr>
-        <w:t xml:space="preserve">Valitse ladattavat aineistot:</w:t>
-      </w:r>
-      <w:r>
-        <w:t xml:space="preserve"> valitse tasot. Valinnat säilyvät, vaikka hakusanaa muutetaan.</w:t>
-      </w:r>
-    </w:p>
-    <w:p>
-      <w:pPr>
-        <w:pStyle w:val="ListParagraph"/>
-        <w:numPr>
-          <w:ilvl w:val="0"/>
-          <w:numId w:val="4"/>
-        </w:numPr>
-        <w:spacing w:after="80"/>
-      </w:pPr>
-      <w:r>
-        <w:rPr>
-          <w:b/>
-          <w:bCs/>
-        </w:rPr>
-        <w:t xml:space="preserve">Aluerajauksen taso:</w:t>
-      </w:r>
-      <w:r>
-        <w:t xml:space="preserve"> valitse Koko Suomi, Elinvoimakeskus, Hyvinvointialue, Maakunta, Kunta/Kaupunki tai Oma aineisto (Polygon/Polyline). Valitse sitten alueet kentässä </w:t>
-      </w:r>
-      <w:r>
-        <w:rPr>
-          <w:b/>
-          <w:bCs/>
-        </w:rPr>
-        <w:t xml:space="preserve">Valitse alue</w:t>
-      </w:r>
-      <w:r>
-        <w:t xml:space="preserve"> tai oma taso kentässä </w:t>
-      </w:r>
-      <w:r>
-        <w:rPr>
-          <w:b/>
-          <w:bCs/>
-        </w:rPr>
-        <w:t xml:space="preserve">Oma rajausaineisto</w:t>
-      </w:r>
-      <w:r>
-        <w:t xml:space="preserve">.</w:t>
-      </w:r>
-    </w:p>
-    <w:p>
-      <w:pPr>
-        <w:pStyle w:val="ListParagraph"/>
-        <w:numPr>
-          <w:ilvl w:val="0"/>
-          <w:numId w:val="4"/>
-        </w:numPr>
-        <w:spacing w:after="80"/>
-      </w:pPr>
-      <w:r>
-        <w:rPr>
-          <w:b/>
-          <w:bCs/>
-        </w:rPr>
-        <w:t xml:space="preserve">Tallennuskohde:</w:t>
-      </w:r>
-      <w:r>
-        <w:t xml:space="preserve"> oletuksena projektin geodatabase. Voit valita myös muun GDB:n tai kansion.</w:t>
-      </w:r>
-    </w:p>
-    <w:p>
-      <w:pPr>
-        <w:pStyle w:val="ListParagraph"/>
-        <w:numPr>
-          <w:ilvl w:val="0"/>
-          <w:numId w:val="4"/>
-        </w:numPr>
-        <w:spacing w:after="80"/>
-      </w:pPr>
-      <w:r>
-        <w:t xml:space="preserve">Jos lähde vaatii tunnuksen, täytä vastaava kenttä (ks. luku 3).</w:t>
-      </w:r>
-    </w:p>
-    <w:p>
-      <w:pPr>
-        <w:pStyle w:val="ListParagraph"/>
-        <w:numPr>
-          <w:ilvl w:val="0"/>
-          <w:numId w:val="4"/>
-        </w:numPr>
-        <w:spacing w:after="80"/>
-      </w:pPr>
-      <w:r>
-        <w:t xml:space="preserve">Valitse </w:t>
-      </w:r>
-      <w:r>
-        <w:rPr>
-          <w:b/>
-          <w:bCs/>
-        </w:rPr>
-        <w:t xml:space="preserve">Run</w:t>
-      </w:r>
-      <w:r>
-        <w:t xml:space="preserve">. Valmiit tasot lisätään aktiiviseen karttaan. Etenemistä voi seurata kohdasta </w:t>
-      </w:r>
-      <w:r>
-        <w:rPr>
-          <w:b/>
-          <w:bCs/>
-        </w:rPr>
-        <w:t xml:space="preserve">View Details → Messages</w:t>
-      </w:r>
-      <w:r>
-        <w:t xml:space="preserve">.</w:t>
-      </w:r>
-    </w:p>
-    <w:tbl>
-      <w:tblPr>
-        <w:tblW w:type="dxa" w:w="9638"/>
-        <w:tblBorders>
-          <w:top w:val="single" w:color="auto" w:sz="4"/>
-          <w:left w:val="single" w:color="auto" w:sz="4"/>
-          <w:bottom w:val="single" w:color="auto" w:sz="4"/>
-          <w:right w:val="single" w:color="auto" w:sz="4"/>
-          <w:insideH w:val="single" w:color="auto" w:sz="4"/>
-          <w:insideV w:val="single" w:color="auto" w:sz="4"/>
-        </w:tblBorders>
-        <w:tblLayout w:type="fixed"/>
-      </w:tblPr>
-      <w:tblGrid>
-        <w:gridCol w:w="3300"/>
-        <w:gridCol w:w="6338"/>
-      </w:tblGrid>
-      <w:tr>
-        <w:trPr>
-          <w:tblHeader/>
-        </w:trPr>
-        <w:tc>
-          <w:tcPr>
-            <w:tcW w:type="dxa" w:w="3300"/>
-            <w:tcBorders>
-              <w:top w:val="single" w:color="BFBFBF" w:sz="4"/>
-              <w:left w:val="single" w:color="BFBFBF" w:sz="4"/>
-              <w:bottom w:val="single" w:color="BFBFBF" w:sz="4"/>
-              <w:right w:val="single" w:color="BFBFBF" w:sz="4"/>
-            </w:tcBorders>
-            <w:shd w:fill="1F4E79" w:color="auto" w:val="clear"/>
-            <w:tcMar>
-              <w:top w:type="dxa" w:w="60"/>
-              <w:left w:type="dxa" w:w="100"/>
-              <w:bottom w:type="dxa" w:w="60"/>
-              <w:right w:type="dxa" w:w="100"/>
-            </w:tcMar>
-          </w:tcPr>
-          <w:p>
-            <w:r>
-              <w:rPr>
-                <w:b/>
-                <w:bCs/>
-                <w:color w:val="FFFFFF"/>
-              </w:rPr>
-              <w:t xml:space="preserve">Kenttä</w:t>
-            </w:r>
-          </w:p>
-        </w:tc>
-        <w:tc>
-          <w:tcPr>
-            <w:tcW w:type="dxa" w:w="6338"/>
-            <w:tcBorders>
-              <w:top w:val="single" w:color="BFBFBF" w:sz="4"/>
-              <w:left w:val="single" w:color="BFBFBF" w:sz="4"/>
-              <w:bottom w:val="single" w:color="BFBFBF" w:sz="4"/>
-              <w:right w:val="single" w:color="BFBFBF" w:sz="4"/>
-            </w:tcBorders>
-            <w:shd w:fill="1F4E79" w:color="auto" w:val="clear"/>
-            <w:tcMar>
-              <w:top w:type="dxa" w:w="60"/>
-              <w:left w:type="dxa" w:w="100"/>
-              <w:bottom w:type="dxa" w:w="60"/>
-              <w:right w:type="dxa" w:w="100"/>
-            </w:tcMar>
-          </w:tcPr>
-          <w:p>
-            <w:r>
-              <w:rPr>
-                <w:b/>
-                <w:bCs/>
-                <w:color w:val="FFFFFF"/>
-              </w:rPr>
-              <w:t xml:space="preserve">Mitä se tekee</w:t>
-            </w:r>
-          </w:p>
-        </w:tc>
-      </w:tr>
-      <w:tr>
-        <w:trPr>
-          <w:cantSplit/>
-        </w:trPr>
-        <w:tc>
-          <w:tcPr>
-            <w:tcW w:type="dxa" w:w="3300"/>
-            <w:tcBorders>
-              <w:top w:val="single" w:color="BFBFBF" w:sz="4"/>
-              <w:left w:val="single" w:color="BFBFBF" w:sz="4"/>
-              <w:bottom w:val="single" w:color="BFBFBF" w:sz="4"/>
-              <w:right w:val="single" w:color="BFBFBF" w:sz="4"/>
-            </w:tcBorders>
-            <w:tcMar>
-              <w:top w:type="dxa" w:w="60"/>
-              <w:left w:type="dxa" w:w="100"/>
-              <w:bottom w:type="dxa" w:w="60"/>
-              <w:right w:type="dxa" w:w="100"/>
-            </w:tcMar>
-          </w:tcPr>
-          <w:p>
-            <w:r>
-              <w:t xml:space="preserve">Valitse rajapinnat</w:t>
-            </w:r>
-          </w:p>
-        </w:tc>
-        <w:tc>
-          <w:tcPr>
-            <w:tcW w:type="dxa" w:w="6338"/>
-            <w:tcBorders>
-              <w:top w:val="single" w:color="BFBFBF" w:sz="4"/>
-              <w:left w:val="single" w:color="BFBFBF" w:sz="4"/>
-              <w:bottom w:val="single" w:color="BFBFBF" w:sz="4"/>
-              <w:right w:val="single" w:color="BFBFBF" w:sz="4"/>
-            </w:tcBorders>
-            <w:tcMar>
-              <w:top w:type="dxa" w:w="60"/>
-              <w:left w:type="dxa" w:w="100"/>
-              <w:bottom w:type="dxa" w:w="60"/>
-              <w:right w:type="dxa" w:w="100"/>
-            </w:tcMar>
-          </w:tcPr>
-          <w:p>
-            <w:r>
-              <w:t xml:space="preserve">Tietolähteet, joista tasot haetaan. Voit valita useita.</w:t>
-            </w:r>
-          </w:p>
-        </w:tc>
-      </w:tr>
-      <w:tr>
-        <w:trPr>
-          <w:cantSplit/>
-        </w:trPr>
-        <w:tc>
-          <w:tcPr>
-            <w:tcW w:type="dxa" w:w="3300"/>
-            <w:tcBorders>
-              <w:top w:val="single" w:color="BFBFBF" w:sz="4"/>
-              <w:left w:val="single" w:color="BFBFBF" w:sz="4"/>
-              <w:bottom w:val="single" w:color="BFBFBF" w:sz="4"/>
-              <w:right w:val="single" w:color="BFBFBF" w:sz="4"/>
-            </w:tcBorders>
-            <w:tcMar>
-              <w:top w:type="dxa" w:w="60"/>
-              <w:left w:type="dxa" w:w="100"/>
-              <w:bottom w:type="dxa" w:w="60"/>
-              <w:right w:type="dxa" w:w="100"/>
-            </w:tcMar>
-          </w:tcPr>
-          <w:p>
-            <w:r>
-              <w:t xml:space="preserve">Suodata tasoja kirjoittamalla</w:t>
-            </w:r>
-          </w:p>
-        </w:tc>
-        <w:tc>
-          <w:tcPr>
-            <w:tcW w:type="dxa" w:w="6338"/>
-            <w:tcBorders>
-              <w:top w:val="single" w:color="BFBFBF" w:sz="4"/>
-              <w:left w:val="single" w:color="BFBFBF" w:sz="4"/>
-              <w:bottom w:val="single" w:color="BFBFBF" w:sz="4"/>
-              <w:right w:val="single" w:color="BFBFBF" w:sz="4"/>
-            </w:tcBorders>
-            <w:tcMar>
-              <w:top w:type="dxa" w:w="60"/>
-              <w:left w:type="dxa" w:w="100"/>
-              <w:bottom w:type="dxa" w:w="60"/>
-              <w:right w:type="dxa" w:w="100"/>
-            </w:tcMar>
-          </w:tcPr>
-          <w:p>
-            <w:r>
-              <w:t xml:space="preserve">Näyttää vain tasot, joiden nimessä on hakusana.</w:t>
-            </w:r>
-          </w:p>
-        </w:tc>
-      </w:tr>
-      <w:tr>
-        <w:trPr>
-          <w:cantSplit/>
-        </w:trPr>
-        <w:tc>
-          <w:tcPr>
-            <w:tcW w:type="dxa" w:w="3300"/>
-            <w:tcBorders>
-              <w:top w:val="single" w:color="BFBFBF" w:sz="4"/>
-              <w:left w:val="single" w:color="BFBFBF" w:sz="4"/>
-              <w:bottom w:val="single" w:color="BFBFBF" w:sz="4"/>
-              <w:right w:val="single" w:color="BFBFBF" w:sz="4"/>
-            </w:tcBorders>
-            <w:tcMar>
-              <w:top w:type="dxa" w:w="60"/>
-              <w:left w:type="dxa" w:w="100"/>
-              <w:bottom w:type="dxa" w:w="60"/>
-              <w:right w:type="dxa" w:w="100"/>
-            </w:tcMar>
-          </w:tcPr>
-          <w:p>
-            <w:r>
-              <w:t xml:space="preserve">Valitse ladattavat aineistot</w:t>
-            </w:r>
-          </w:p>
-        </w:tc>
-        <w:tc>
-          <w:tcPr>
-            <w:tcW w:type="dxa" w:w="6338"/>
-            <w:tcBorders>
-              <w:top w:val="single" w:color="BFBFBF" w:sz="4"/>
-              <w:left w:val="single" w:color="BFBFBF" w:sz="4"/>
-              <w:bottom w:val="single" w:color="BFBFBF" w:sz="4"/>
-              <w:right w:val="single" w:color="BFBFBF" w:sz="4"/>
-            </w:tcBorders>
-            <w:tcMar>
-              <w:top w:type="dxa" w:w="60"/>
-              <w:left w:type="dxa" w:w="100"/>
-              <w:bottom w:type="dxa" w:w="60"/>
-              <w:right w:type="dxa" w:w="100"/>
-            </w:tcMar>
-          </w:tcPr>
-          <w:p>
-            <w:r>
-              <w:t xml:space="preserve">Ladattavat tasot. Luettelo muodostetaan palveluiden ajantasaisista tiedoista.</w:t>
-            </w:r>
-          </w:p>
-        </w:tc>
-      </w:tr>
-      <w:tr>
-        <w:trPr>
-          <w:cantSplit/>
-        </w:trPr>
-        <w:tc>
-          <w:tcPr>
-            <w:tcW w:type="dxa" w:w="3300"/>
-            <w:tcBorders>
-              <w:top w:val="single" w:color="BFBFBF" w:sz="4"/>
-              <w:left w:val="single" w:color="BFBFBF" w:sz="4"/>
-              <w:bottom w:val="single" w:color="BFBFBF" w:sz="4"/>
-              <w:right w:val="single" w:color="BFBFBF" w:sz="4"/>
-            </w:tcBorders>
-            <w:tcMar>
-              <w:top w:type="dxa" w:w="60"/>
-              <w:left w:type="dxa" w:w="100"/>
-              <w:bottom w:type="dxa" w:w="60"/>
-              <w:right w:type="dxa" w:w="100"/>
-            </w:tcMar>
-          </w:tcPr>
-          <w:p>
-            <w:r>
-              <w:t xml:space="preserve">Aluerajauksen taso / Valitse alue</w:t>
-            </w:r>
-          </w:p>
-        </w:tc>
-        <w:tc>
-          <w:tcPr>
-            <w:tcW w:type="dxa" w:w="6338"/>
-            <w:tcBorders>
-              <w:top w:val="single" w:color="BFBFBF" w:sz="4"/>
-              <w:left w:val="single" w:color="BFBFBF" w:sz="4"/>
-              <w:bottom w:val="single" w:color="BFBFBF" w:sz="4"/>
-              <w:right w:val="single" w:color="BFBFBF" w:sz="4"/>
-            </w:tcBorders>
-            <w:tcMar>
-              <w:top w:type="dxa" w:w="60"/>
-              <w:left w:type="dxa" w:w="100"/>
-              <w:bottom w:type="dxa" w:w="60"/>
-              <w:right w:type="dxa" w:w="100"/>
-            </w:tcMar>
-          </w:tcPr>
-          <w:p>
-            <w:r>
-              <w:t xml:space="preserve">Hallinnollinen rajaus. Koko Suomi ei vaadi aluevalintaa.</w:t>
-            </w:r>
-          </w:p>
-        </w:tc>
-      </w:tr>
-      <w:tr>
-        <w:trPr>
-          <w:cantSplit/>
-        </w:trPr>
-        <w:tc>
-          <w:tcPr>
-            <w:tcW w:type="dxa" w:w="3300"/>
-            <w:tcBorders>
-              <w:top w:val="single" w:color="BFBFBF" w:sz="4"/>
-              <w:left w:val="single" w:color="BFBFBF" w:sz="4"/>
-              <w:bottom w:val="single" w:color="BFBFBF" w:sz="4"/>
-              <w:right w:val="single" w:color="BFBFBF" w:sz="4"/>
-            </w:tcBorders>
-            <w:tcMar>
-              <w:top w:type="dxa" w:w="60"/>
-              <w:left w:type="dxa" w:w="100"/>
-              <w:bottom w:type="dxa" w:w="60"/>
-              <w:right w:type="dxa" w:w="100"/>
-            </w:tcMar>
-          </w:tcPr>
-          <w:p>
-            <w:r>
-              <w:t xml:space="preserve">Oma rajausaineisto</w:t>
-            </w:r>
-          </w:p>
-        </w:tc>
-        <w:tc>
-          <w:tcPr>
-            <w:tcW w:type="dxa" w:w="6338"/>
-            <w:tcBorders>
-              <w:top w:val="single" w:color="BFBFBF" w:sz="4"/>
-              <w:left w:val="single" w:color="BFBFBF" w:sz="4"/>
-              <w:bottom w:val="single" w:color="BFBFBF" w:sz="4"/>
-              <w:right w:val="single" w:color="BFBFBF" w:sz="4"/>
-            </w:tcBorders>
-            <w:tcMar>
-              <w:top w:type="dxa" w:w="60"/>
-              <w:left w:type="dxa" w:w="100"/>
-              <w:bottom w:type="dxa" w:w="60"/>
-              <w:right w:type="dxa" w:w="100"/>
-            </w:tcMar>
-          </w:tcPr>
-          <w:p>
-            <w:r>
-              <w:t xml:space="preserve">Kartan polygon- tai viivataso omaa rajausta varten.</w:t>
-            </w:r>
-          </w:p>
-        </w:tc>
-      </w:tr>
-      <w:tr>
-        <w:trPr>
-          <w:cantSplit/>
-        </w:trPr>
-        <w:tc>
-          <w:tcPr>
-            <w:tcW w:type="dxa" w:w="3300"/>
-            <w:tcBorders>
-              <w:top w:val="single" w:color="BFBFBF" w:sz="4"/>
-              <w:left w:val="single" w:color="BFBFBF" w:sz="4"/>
-              <w:bottom w:val="single" w:color="BFBFBF" w:sz="4"/>
-              <w:right w:val="single" w:color="BFBFBF" w:sz="4"/>
-            </w:tcBorders>
-            <w:tcMar>
-              <w:top w:type="dxa" w:w="60"/>
-              <w:left w:type="dxa" w:w="100"/>
-              <w:bottom w:type="dxa" w:w="60"/>
-              <w:right w:type="dxa" w:w="100"/>
-            </w:tcMar>
-          </w:tcPr>
-          <w:p>
-            <w:r>
-              <w:t xml:space="preserve">Tallennuskohde (GDB tai kansio)</w:t>
-            </w:r>
-          </w:p>
-        </w:tc>
-        <w:tc>
-          <w:tcPr>
-            <w:tcW w:type="dxa" w:w="6338"/>
-            <w:tcBorders>
-              <w:top w:val="single" w:color="BFBFBF" w:sz="4"/>
-              <w:left w:val="single" w:color="BFBFBF" w:sz="4"/>
-              <w:bottom w:val="single" w:color="BFBFBF" w:sz="4"/>
-              <w:right w:val="single" w:color="BFBFBF" w:sz="4"/>
-            </w:tcBorders>
-            <w:tcMar>
-              <w:top w:type="dxa" w:w="60"/>
-              <w:left w:type="dxa" w:w="100"/>
-              <w:bottom w:type="dxa" w:w="60"/>
-              <w:right w:type="dxa" w:w="100"/>
-            </w:tcMar>
-          </w:tcPr>
-          <w:p>
-            <w:r>
-              <w:t xml:space="preserve">Kohde, johon valmiit tasot tallennetaan.</w:t>
-            </w:r>
-          </w:p>
-        </w:tc>
-      </w:tr>
-      <w:tr>
-        <w:trPr>
-          <w:cantSplit/>
-        </w:trPr>
-        <w:tc>
-          <w:tcPr>
-            <w:tcW w:type="dxa" w:w="3300"/>
-            <w:tcBorders>
-              <w:top w:val="single" w:color="BFBFBF" w:sz="4"/>
-              <w:left w:val="single" w:color="BFBFBF" w:sz="4"/>
-              <w:bottom w:val="single" w:color="BFBFBF" w:sz="4"/>
-              <w:right w:val="single" w:color="BFBFBF" w:sz="4"/>
-            </w:tcBorders>
-            <w:tcMar>
-              <w:top w:type="dxa" w:w="60"/>
-              <w:left w:type="dxa" w:w="100"/>
-              <w:bottom w:type="dxa" w:w="60"/>
-              <w:right w:type="dxa" w:w="100"/>
-            </w:tcMar>
-          </w:tcPr>
-          <w:p>
-            <w:r>
-              <w:t xml:space="preserve">Päivitä tasolistaus palvelusta</w:t>
-            </w:r>
-          </w:p>
-        </w:tc>
-        <w:tc>
-          <w:tcPr>
-            <w:tcW w:type="dxa" w:w="6338"/>
-            <w:tcBorders>
-              <w:top w:val="single" w:color="BFBFBF" w:sz="4"/>
-              <w:left w:val="single" w:color="BFBFBF" w:sz="4"/>
-              <w:bottom w:val="single" w:color="BFBFBF" w:sz="4"/>
-              <w:right w:val="single" w:color="BFBFBF" w:sz="4"/>
-            </w:tcBorders>
-            <w:tcMar>
-              <w:top w:type="dxa" w:w="60"/>
-              <w:left w:type="dxa" w:w="100"/>
-              <w:bottom w:type="dxa" w:w="60"/>
-              <w:right w:type="dxa" w:w="100"/>
-            </w:tcMar>
-          </w:tcPr>
-          <w:p>
-            <w:r>
-              <w:t xml:space="preserve">Hakee tasoluettelon uudelleen ohi 24 tunnin välimuistin. Käytä, jos uusi taso puuttuu luettelosta.</w:t>
-            </w:r>
-          </w:p>
-        </w:tc>
-      </w:tr>
-      <w:tr>
-        <w:trPr>
-          <w:cantSplit/>
-        </w:trPr>
-        <w:tc>
-          <w:tcPr>
-            <w:tcW w:type="dxa" w:w="3300"/>
-            <w:tcBorders>
-              <w:top w:val="single" w:color="BFBFBF" w:sz="4"/>
-              <w:left w:val="single" w:color="BFBFBF" w:sz="4"/>
-              <w:bottom w:val="single" w:color="BFBFBF" w:sz="4"/>
-              <w:right w:val="single" w:color="BFBFBF" w:sz="4"/>
-            </w:tcBorders>
-            <w:tcMar>
-              <w:top w:type="dxa" w:w="60"/>
-              <w:left w:type="dxa" w:w="100"/>
-              <w:bottom w:type="dxa" w:w="60"/>
-              <w:right w:type="dxa" w:w="100"/>
-            </w:tcMar>
-          </w:tcPr>
-          <w:p>
-            <w:r>
-              <w:t xml:space="preserve">API-avaimet, tunnukset, Aino-token</w:t>
-            </w:r>
-          </w:p>
-        </w:tc>
-        <w:tc>
-          <w:tcPr>
-            <w:tcW w:type="dxa" w:w="6338"/>
-            <w:tcBorders>
-              <w:top w:val="single" w:color="BFBFBF" w:sz="4"/>
-              <w:left w:val="single" w:color="BFBFBF" w:sz="4"/>
-              <w:bottom w:val="single" w:color="BFBFBF" w:sz="4"/>
-              <w:right w:val="single" w:color="BFBFBF" w:sz="4"/>
-            </w:tcBorders>
-            <w:tcMar>
-              <w:top w:type="dxa" w:w="60"/>
-              <w:left w:type="dxa" w:w="100"/>
-              <w:bottom w:type="dxa" w:w="60"/>
-              <w:right w:type="dxa" w:w="100"/>
-            </w:tcMar>
-          </w:tcPr>
-          <w:p>
-            <w:r>
-              <w:t xml:space="preserve">Tarvitaan vain tietyissä lähteissä. Avaimet tallennetaan salattuina.</w:t>
-            </w:r>
-          </w:p>
-        </w:tc>
-      </w:tr>
-    </w:tbl>
-    <w:p>
-      <w:pPr>
-        <w:pBdr>
-          <w:left w:val="single" w:color="1F4E79" w:sz="18" w:space="8"/>
-        </w:pBdr>
-        <w:shd w:fill="EAF1F8" w:color="auto" w:val="clear"/>
-        <w:spacing w:after="180" w:before="120"/>
-        <w:ind w:left="170" w:right="170"/>
-      </w:pPr>
-      <w:r>
-        <w:rPr>
-          <w:b/>
-          <w:bCs/>
-          <w:color w:val="1F4E79"/>
-        </w:rPr>
-        <w:t xml:space="preserve">Hyvä tietää: </w:t>
-      </w:r>
-      <w:r>
-        <w:t xml:space="preserve">Väylän ja DigiRoadin kohteet tallennetaan kokonaisina, jos ne leikkaavat rajausta. Muiden lähteiden aineistot leikataan rajauksen muotoon. Mitä pienempi rajaus ja mitä vähemmän tasoja, sitä nopeampi lataus.</w:t>
-      </w:r>
-    </w:p>
-    <w:p>
-      <w:pPr>
-        <w:pStyle w:val="Heading2"/>
-        <w:keepNext/>
-      </w:pPr>
-      <w:r>
-        <w:t xml:space="preserve">1.3  Taustakartat (MML/Kapsi)</w:t>
-      </w:r>
-    </w:p>
-    <w:p>
-      <w:pPr>
-        <w:keepNext/>
-        <w:spacing w:after="120"/>
-      </w:pPr>
-      <w:r>
-        <w:t xml:space="preserve">Taustakarttatyökalu on samassa työkalupakissa kuin Suomenväylät.fi. Lisää työkalupakki projektiin kerran:</w:t>
-      </w:r>
-    </w:p>
-    <w:p>
-      <w:pPr>
-        <w:pStyle w:val="ListParagraph"/>
-        <w:numPr>
-          <w:ilvl w:val="0"/>
-          <w:numId w:val="5"/>
-        </w:numPr>
-        <w:spacing w:after="80"/>
-      </w:pPr>
-      <w:r>
-        <w:t xml:space="preserve">Avaa </w:t>
-      </w:r>
-      <w:r>
-        <w:rPr>
-          <w:b/>
-          <w:bCs/>
-        </w:rPr>
-        <w:t xml:space="preserve">Catalog</w:t>
-      </w:r>
-      <w:r>
-        <w:t xml:space="preserve">-paneeli. Napsauta </w:t>
-      </w:r>
-      <w:r>
-        <w:rPr>
-          <w:b/>
-          <w:bCs/>
-        </w:rPr>
-        <w:t xml:space="preserve">Toolboxes</w:t>
-      </w:r>
-      <w:r>
-        <w:t xml:space="preserve">-kohtaa hiiren oikealla painikkeella ja valitse </w:t>
-      </w:r>
-      <w:r>
-        <w:rPr>
-          <w:b/>
-          <w:bCs/>
-        </w:rPr>
-        <w:t xml:space="preserve">Add Toolbox</w:t>
-      </w:r>
-      <w:r>
-        <w:t xml:space="preserve">.</w:t>
-      </w:r>
-    </w:p>
-    <w:p>
-      <w:pPr>
-        <w:pStyle w:val="ListParagraph"/>
-        <w:numPr>
-          <w:ilvl w:val="0"/>
-          <w:numId w:val="5"/>
-        </w:numPr>
-        <w:spacing w:after="80"/>
-      </w:pPr>
-      <w:r>
-        <w:t xml:space="preserve">Liitä osoiteriville polku %LOCALAPPDATA%\ESRI\ArcGISPro\AssemblyCache\{2aea3c93-c012-4ed4-b416-6b3a844e0204}\Toolboxes ja valitse </w:t>
-      </w:r>
-      <w:r>
-        <w:rPr>
-          <w:b/>
-          <w:bCs/>
-        </w:rPr>
-        <w:t xml:space="preserve">VaylaWFSDownloader.pyt</w:t>
-      </w:r>
-      <w:r>
-        <w:t xml:space="preserve">.</w:t>
-      </w:r>
-    </w:p>
-    <w:p>
-      <w:pPr>
-        <w:pStyle w:val="ListParagraph"/>
-        <w:numPr>
-          <w:ilvl w:val="0"/>
-          <w:numId w:val="5"/>
-        </w:numPr>
-        <w:spacing w:after="80"/>
-      </w:pPr>
-      <w:r>
-        <w:t xml:space="preserve">Avaa työkalupakista </w:t>
-      </w:r>
-      <w:r>
-        <w:rPr>
-          <w:b/>
-          <w:bCs/>
-        </w:rPr>
-        <w:t xml:space="preserve">Taustakartat (MML/Kapsi)</w:t>
-      </w:r>
-      <w:r>
-        <w:t xml:space="preserve">.</w:t>
-      </w:r>
-    </w:p>
-    <w:p>
-      <w:pPr>
-        <w:spacing w:after="120"/>
-      </w:pPr>
-      <w:r>
-        <w:rPr>
-          <w:b/>
-          <w:bCs/>
-        </w:rPr>
-        <w:t xml:space="preserve">MML, live-taustakartta:</w:t>
-      </w:r>
-      <w:r>
-        <w:t xml:space="preserve"> Valitse Taustakarttapalvelu </w:t>
-      </w:r>
-      <w:r>
-        <w:rPr>
-          <w:b/>
-          <w:bCs/>
-        </w:rPr>
-        <w:t xml:space="preserve">MML</w:t>
-      </w:r>
-      <w:r>
-        <w:t xml:space="preserve"> ja anna MML API-avain. Valitse sitten Taustakartta, Maastokartta tai Kiinteistöjaotus ja paina </w:t>
-      </w:r>
-      <w:r>
-        <w:rPr>
-          <w:b/>
-          <w:bCs/>
-        </w:rPr>
-        <w:t xml:space="preserve">Run</w:t>
-      </w:r>
-      <w:r>
-        <w:t xml:space="preserve">. Taso lisätään karttaan live-vektoritiilinä ja se päivittyy karttanäkymän mukaan. Rajausta tai tallennuskohdetta ei tarvita.</w:t>
-      </w:r>
-    </w:p>
-    <w:p>
-      <w:pPr>
-        <w:spacing w:after="120"/>
-      </w:pPr>
-      <w:r>
-        <w:rPr>
-          <w:b/>
-          <w:bCs/>
-        </w:rPr>
-        <w:t xml:space="preserve">Kapsi, rasterilataus:</w:t>
-      </w:r>
-      <w:r>
-        <w:t xml:space="preserve"> Valitse </w:t>
-      </w:r>
-      <w:r>
-        <w:rPr>
-          <w:b/>
-          <w:bCs/>
-        </w:rPr>
-        <w:t xml:space="preserve">Kapsi</w:t>
-      </w:r>
-      <w:r>
-        <w:t xml:space="preserve"> ja karttataso. Valitse sitten aluerajaus ja tallennuskohde ja paina </w:t>
-      </w:r>
-      <w:r>
-        <w:rPr>
-          <w:b/>
-          <w:bCs/>
-        </w:rPr>
-        <w:t xml:space="preserve">Run</w:t>
-      </w:r>
-      <w:r>
-        <w:t xml:space="preserve">. Työkalu lataa alueen JPEG-laatat, yhdistää ne yhdeksi rasteriksi ja lisää sen karttaan.</w:t>
-      </w:r>
-    </w:p>
-    <w:p>
-      <w:pPr>
-        <w:pStyle w:val="Heading1"/>
-        <w:pageBreakBefore/>
-      </w:pPr>
-      <w:r>
-        <w:t xml:space="preserve">2  QGIS</w:t>
-      </w:r>
-    </w:p>
-    <w:p>
-      <w:pPr>
-        <w:pStyle w:val="Heading2"/>
-        <w:keepNext/>
-      </w:pPr>
-      <w:r>
-        <w:t xml:space="preserve">2.1  Asennus (suositus: Windows-asennuspaketti)</w:t>
-      </w:r>
-    </w:p>
-    <w:p>
-      <w:pPr>
-        <w:pStyle w:val="ListParagraph"/>
-        <w:numPr>
-          <w:ilvl w:val="0"/>
-          <w:numId w:val="6"/>
-        </w:numPr>
-        <w:spacing w:after="80"/>
-      </w:pPr>
-      <w:r>
-        <w:rPr>
-          <w:b/>
-          <w:bCs/>
-        </w:rPr>
-        <w:t xml:space="preserve">Sulje QGIS</w:t>
-      </w:r>
-      <w:r>
-        <w:t xml:space="preserve"> (kaikki ikkunat).</w:t>
-      </w:r>
-    </w:p>
-    <w:p>
-      <w:pPr>
-        <w:pStyle w:val="ListParagraph"/>
-        <w:numPr>
-          <w:ilvl w:val="0"/>
-          <w:numId w:val="6"/>
-        </w:numPr>
-        <w:spacing w:after="80"/>
-      </w:pPr>
-      <w:r>
-        <w:t xml:space="preserve">Napsauta </w:t>
-      </w:r>
-      <w:r>
-        <w:rPr>
-          <w:b/>
-          <w:bCs/>
-        </w:rPr>
-        <w:t xml:space="preserve">Suomenvaylat-QGIS-0.2.9-Windows.zip</w:t>
-      </w:r>
-      <w:r>
-        <w:t xml:space="preserve">-tiedostoa hiiren oikealla ja valitse </w:t>
-      </w:r>
-      <w:r>
-        <w:rPr>
-          <w:b/>
-          <w:bCs/>
-        </w:rPr>
-        <w:t xml:space="preserve">Pura kaikki</w:t>
-      </w:r>
-      <w:r>
-        <w:t xml:space="preserve">. Asennusta ei voi ajaa suoraan ZIP-paketin sisältä.</w:t>
-      </w:r>
-    </w:p>
-    <w:p>
-      <w:pPr>
-        <w:pStyle w:val="ListParagraph"/>
-        <w:numPr>
-          <w:ilvl w:val="0"/>
-          <w:numId w:val="6"/>
-        </w:numPr>
-        <w:spacing w:after="80"/>
-      </w:pPr>
-      <w:r>
-        <w:t xml:space="preserve">Avaa purettu kansio ja kaksoisnapsauta </w:t>
-      </w:r>
-      <w:r>
-        <w:rPr>
-          <w:b/>
-          <w:bCs/>
-        </w:rPr>
-        <w:t xml:space="preserve">install_windows.bat</w:t>
-      </w:r>
-      <w:r>
-        <w:t xml:space="preserve">.</w:t>
-      </w:r>
-    </w:p>
-    <w:p>
-      <w:pPr>
-        <w:pStyle w:val="ListParagraph"/>
-        <w:numPr>
-          <w:ilvl w:val="0"/>
-          <w:numId w:val="6"/>
-        </w:numPr>
-        <w:spacing w:after="80"/>
-      </w:pPr>
-      <w:r>
-        <w:t xml:space="preserve">Asennusikkunassa näkyy </w:t>
-      </w:r>
-      <w:r>
-        <w:rPr>
-          <w:b/>
-          <w:bCs/>
-        </w:rPr>
-        <w:t xml:space="preserve">Asennettu profiiliin: …</w:t>
-      </w:r>
-      <w:r>
-        <w:t xml:space="preserve"> (esim. default) ja </w:t>
-      </w:r>
-      <w:r>
-        <w:rPr>
-          <w:b/>
-          <w:bCs/>
-        </w:rPr>
-        <w:t xml:space="preserve">Valmis</w:t>
-      </w:r>
-      <w:r>
-        <w:t xml:space="preserve">. Sulje ikkuna painamalla mitä tahansa näppäintä.</w:t>
-      </w:r>
-    </w:p>
-    <w:p>
-      <w:pPr>
-        <w:pStyle w:val="ListParagraph"/>
-        <w:numPr>
-          <w:ilvl w:val="0"/>
-          <w:numId w:val="6"/>
-        </w:numPr>
-        <w:spacing w:after="80"/>
-      </w:pPr>
-      <w:r>
-        <w:t xml:space="preserve">Käynnistä QGIS. Suomenväylät-kuvake näkyy työkalupalkissa ja valikossa </w:t>
-      </w:r>
-      <w:r>
-        <w:rPr>
-          <w:b/>
-          <w:bCs/>
-        </w:rPr>
-        <w:t xml:space="preserve">Lisäosat → Suomenväylät</w:t>
-      </w:r>
-      <w:r>
-        <w:t xml:space="preserve">.</w:t>
-      </w:r>
-    </w:p>
-    <w:p>
-      <w:pPr>
-        <w:spacing w:after="120"/>
+        <w:spacing w:before="120"/>
+        <w:jc w:val="center"/>
       </w:pPr>
       <w:r>
         <w:drawing>
           <wp:inline distT="0" distB="0" distL="0" distR="0">
-            <wp:extent cx="266700" cy="266700"/>
-            <wp:effectExtent t="0" r="0" b="0" l="0"/>
-            <wp:docPr id="2" name="icon" descr="Työkalun kuvake" title="Kuvake"/>
-            <wp:cNvGraphicFramePr>
-              <a:graphicFrameLocks xmlns:a="http://schemas.openxmlformats.org/drawingml/2006/main" noChangeAspect="1"/>
-            </wp:cNvGraphicFramePr>
-            <a:graphic xmlns:a="http://schemas.openxmlformats.org/drawingml/2006/main">
-              <a:graphicData uri="http://schemas.openxmlformats.org/drawingml/2006/picture">
-                <pic:pic xmlns:pic="http://schemas.openxmlformats.org/drawingml/2006/picture">
-                  <pic:nvPicPr>
-                    <pic:cNvPr id="0" name="" descr=""/>
-                    <pic:cNvPicPr>
-                      <a:picLocks noChangeAspect="1" noChangeArrowheads="1"/>
-                    </pic:cNvPicPr>
-                  </pic:nvPicPr>
-                  <pic:blipFill>
-                    <a:blip r:embed="rId8" cstate="none"/>
-                    <a:srcRect/>
-                    <a:stretch>
-                      <a:fillRect/>
-                    </a:stretch>
-                  </pic:blipFill>
-                  <pic:spPr bwMode="auto">
-                    <a:xfrm>
-                      <a:off x="0" y="0"/>
-                      <a:ext cx="266700" cy="266700"/>
-                    </a:xfrm>
-                    <a:prstGeom prst="rect">
-                      <a:avLst/>
-                    </a:prstGeom>
-                  </pic:spPr>
-                </pic:pic>
-              </a:graphicData>
-            </a:graphic>
-          </wp:inline>
-        </w:drawing>
-      </w:r>
-      <w:r>
-        <w:t xml:space="preserve">  </w:t>
-      </w:r>
-      <w:r>
-        <w:t xml:space="preserve">Tämä kuvake avaa Suomenväylät-ikkunan QGISissä.</w:t>
-      </w:r>
-    </w:p>
-    <w:p>
-      <w:pPr>
-        <w:pBdr>
-          <w:left w:val="single" w:color="1F4E79" w:sz="18" w:space="8"/>
-        </w:pBdr>
-        <w:shd w:fill="EAF1F8" w:color="auto" w:val="clear"/>
-        <w:spacing w:after="180" w:before="120"/>
-        <w:ind w:left="170" w:right="170"/>
-      </w:pPr>
-      <w:r>
-        <w:rPr>
-          <w:b/>
-          <w:bCs/>
-          <w:color w:val="1F4E79"/>
-        </w:rPr>
-        <w:t xml:space="preserve">Jos Windows varoittaa </w:t>
-      </w:r>
-      <w:r>
-        <w:t xml:space="preserve">tuntemattomasta sovelluksesta (SmartScreen), valitse </w:t>
-      </w:r>
-      <w:r>
-        <w:rPr>
-          <w:b/>
-          <w:bCs/>
-        </w:rPr>
-        <w:t xml:space="preserve">Lisätietoja → Suorita silti</w:t>
-      </w:r>
-      <w:r>
-        <w:t xml:space="preserve">. Asennin kopioi lisäosan käyttäjän QGIS-profiileihin ja ottaa sen käyttöön. Järjestelmänvalvojan oikeuksia ei tarvita.</w:t>
-      </w:r>
-    </w:p>
-    <w:p>
-      <w:pPr>
-        <w:spacing w:after="120"/>
-      </w:pPr>
-      <w:r>
-        <w:rPr>
-          <w:b/>
-          <w:bCs/>
-        </w:rPr>
-        <w:t xml:space="preserve">Vaihtoehto: asennus QGISissä.</w:t>
-      </w:r>
-      <w:r>
-        <w:t xml:space="preserve"> Valitse </w:t>
-      </w:r>
-      <w:r>
-        <w:rPr>
-          <w:b/>
-          <w:bCs/>
-        </w:rPr>
-        <w:t xml:space="preserve">Lisäosat → Hallitse ja asenna lisäosia → Asenna ZIP-tiedostosta</w:t>
-      </w:r>
-      <w:r>
-        <w:t xml:space="preserve">. Valitse tiedosto </w:t>
-      </w:r>
-      <w:r>
-        <w:rPr>
-          <w:b/>
-          <w:bCs/>
-        </w:rPr>
-        <w:t xml:space="preserve">Suomenvaylat-QGIS-0.2.9.zip</w:t>
-      </w:r>
-      <w:r>
-        <w:t xml:space="preserve"> ja paina </w:t>
-      </w:r>
-      <w:r>
-        <w:rPr>
-          <w:b/>
-          <w:bCs/>
-        </w:rPr>
-        <w:t xml:space="preserve">Asenna lisäosa</w:t>
-      </w:r>
-      <w:r>
-        <w:t xml:space="preserve">. Tämä tiedosto on eri kuin Windows-paketti.</w:t>
-      </w:r>
-    </w:p>
-    <w:p>
-      <w:pPr>
-        <w:pBdr>
-          <w:left w:val="single" w:color="1F4E79" w:sz="18" w:space="8"/>
-        </w:pBdr>
-        <w:shd w:fill="EAF1F8" w:color="auto" w:val="clear"/>
-        <w:spacing w:after="180" w:before="120"/>
-        <w:ind w:left="170" w:right="170"/>
-      </w:pPr>
-      <w:r>
-        <w:rPr>
-          <w:b/>
-          <w:bCs/>
-          <w:color w:val="1F4E79"/>
-        </w:rPr>
-        <w:t xml:space="preserve">Päivitys: </w:t>
-      </w:r>
-      <w:r>
-        <w:t xml:space="preserve">Aja uuden version install_windows.bat QGIS suljettuna. Asennin poistaa vanhan version ennen uuden kopiointia.</w:t>
-      </w:r>
-    </w:p>
-    <w:p>
-      <w:pPr>
-        <w:pStyle w:val="Heading2"/>
-        <w:keepNext/>
-      </w:pPr>
-      <w:r>
-        <w:t xml:space="preserve">2.2  Aineistojen lataus: Hae aineistoja</w:t>
-      </w:r>
-    </w:p>
-    <w:p>
-      <w:pPr>
-        <w:spacing w:after="120"/>
-      </w:pPr>
-      <w:r>
-        <w:t xml:space="preserve">Avaa Suomenväylät-ikkuna kuvakkeesta. Ikkuna etenee ylhäältä alas kolmessa numeroidussa vaiheessa (kuva 1).</w:t>
-      </w:r>
-    </w:p>
-    <w:p>
-      <w:pPr>
-        <w:pStyle w:val="ListParagraph"/>
-        <w:numPr>
-          <w:ilvl w:val="0"/>
-          <w:numId w:val="7"/>
-        </w:numPr>
-        <w:spacing w:after="80"/>
-      </w:pPr>
-      <w:r>
-        <w:t xml:space="preserve">Kohdassa </w:t>
-      </w:r>
-      <w:r>
-        <w:rPr>
-          <w:b/>
-          <w:bCs/>
-        </w:rPr>
-        <w:t xml:space="preserve">Valitse tietolähteet</w:t>
-      </w:r>
-      <w:r>
-        <w:t xml:space="preserve"> ruksi lähteet. Jos lähde tarvitsee tunnuksen, näkyviin tulee </w:t>
-      </w:r>
-      <w:r>
-        <w:rPr>
-          <w:b/>
-          <w:bCs/>
-        </w:rPr>
-        <w:t xml:space="preserve">Tunnukset valituille lähteille</w:t>
-      </w:r>
-      <w:r>
-        <w:t xml:space="preserve"> -kenttä (kuva 2).</w:t>
-      </w:r>
-    </w:p>
-    <w:p>
-      <w:pPr>
-        <w:pStyle w:val="ListParagraph"/>
-        <w:numPr>
-          <w:ilvl w:val="0"/>
-          <w:numId w:val="7"/>
-        </w:numPr>
-        <w:spacing w:after="80"/>
-      </w:pPr>
-      <w:r>
-        <w:t xml:space="preserve">Kohdassa </w:t>
-      </w:r>
-      <w:r>
-        <w:rPr>
-          <w:b/>
-          <w:bCs/>
-        </w:rPr>
-        <w:t xml:space="preserve">Hae ja valitse aineistot</w:t>
-      </w:r>
-      <w:r>
-        <w:t xml:space="preserve"> paina </w:t>
-      </w:r>
-      <w:r>
-        <w:rPr>
-          <w:b/>
-          <w:bCs/>
-        </w:rPr>
-        <w:t xml:space="preserve">Hae tasot</w:t>
-      </w:r>
-      <w:r>
-        <w:t xml:space="preserve">. Rajaa luetteloa hakukentällä ja ruksi ladattavat tasot. </w:t>
-      </w:r>
-      <w:r>
-        <w:rPr>
-          <w:b/>
-          <w:bCs/>
-        </w:rPr>
-        <w:t xml:space="preserve">Valitse näkyvät</w:t>
-      </w:r>
-      <w:r>
-        <w:t xml:space="preserve"> ruksii kaikki hakua vastaavat tasot. Valinnat säilyvät, vaikka hakusanaa vaihdetaan.</w:t>
-      </w:r>
-    </w:p>
-    <w:p>
-      <w:pPr>
-        <w:pStyle w:val="ListParagraph"/>
-        <w:numPr>
-          <w:ilvl w:val="0"/>
-          <w:numId w:val="7"/>
-        </w:numPr>
-        <w:spacing w:after="80"/>
-      </w:pPr>
-      <w:r>
-        <w:t xml:space="preserve">Kohdassa </w:t>
-      </w:r>
-      <w:r>
-        <w:rPr>
-          <w:b/>
-          <w:bCs/>
-        </w:rPr>
-        <w:t xml:space="preserve">Rajaa tiedostoon ladattavat aineistot</w:t>
-      </w:r>
-      <w:r>
-        <w:t xml:space="preserve"> valitse aluerajaus (Koko Suomi, Elinvoimakeskus, Hyvinvointialue, Maakunta, Kunta/Kaupunki tai Oma aineisto). Ruksi sitten alueet tai valitse oma polygon- tai viivataso.</w:t>
-      </w:r>
-    </w:p>
-    <w:p>
-      <w:pPr>
-        <w:pStyle w:val="ListParagraph"/>
-        <w:numPr>
-          <w:ilvl w:val="0"/>
-          <w:numId w:val="7"/>
-        </w:numPr>
-        <w:spacing w:after="80"/>
-      </w:pPr>
-      <w:r>
-        <w:rPr>
-          <w:b/>
-          <w:bCs/>
-        </w:rPr>
-        <w:t xml:space="preserve">Tallennuskansio:</w:t>
-      </w:r>
-      <w:r>
-        <w:t xml:space="preserve"> tallennetun projektin kansio täytetään automaattisesti. Tallenna siksi projekti ennen latausta tai valitse kansio </w:t>
-      </w:r>
-      <w:r>
-        <w:rPr>
-          <w:b/>
-          <w:bCs/>
-        </w:rPr>
-        <w:t xml:space="preserve">Valitse…</w:t>
-      </w:r>
-      <w:r>
-        <w:t xml:space="preserve">-painikkeella.</w:t>
-      </w:r>
-    </w:p>
-    <w:p>
-      <w:pPr>
-        <w:pStyle w:val="ListParagraph"/>
-        <w:numPr>
-          <w:ilvl w:val="0"/>
-          <w:numId w:val="7"/>
-        </w:numPr>
-        <w:spacing w:after="80"/>
-      </w:pPr>
-      <w:r>
-        <w:t xml:space="preserve">Paina </w:t>
-      </w:r>
-      <w:r>
-        <w:rPr>
-          <w:b/>
-          <w:bCs/>
-        </w:rPr>
-        <w:t xml:space="preserve">Lataa valitut aineistot</w:t>
-      </w:r>
-      <w:r>
-        <w:t xml:space="preserve">. Lataus toimii taustalla, joten QGISiä voi käyttää sillä aikaa. </w:t>
-      </w:r>
-      <w:r>
-        <w:rPr>
-          <w:b/>
-          <w:bCs/>
-        </w:rPr>
-        <w:t xml:space="preserve">Keskeytä</w:t>
-      </w:r>
-      <w:r>
-        <w:t xml:space="preserve"> pysäyttää latauksen.</w:t>
-      </w:r>
-    </w:p>
-    <w:p>
-      <w:pPr>
-        <w:keepNext/>
-        <w:spacing w:after="60" w:before="120"/>
-        <w:jc w:val="center"/>
-      </w:pPr>
-      <w:r>
-        <w:drawing>
-          <wp:inline distT="0" distB="0" distL="0" distR="0">
-            <wp:extent cx="4476750" cy="4914900"/>
-            <wp:effectExtent t="0" r="0" b="0" l="0"/>
-            <wp:docPr id="3" name="qgis_02_data_filled.png" descr="Kuva 1. Hae aineistoja: Väylän ja DigiRoadin nopeusrajoitukset rajattuna Tampereelle." title="Kuva 1. Hae aineistoja: Väylän ja DigiRoadin nopeusrajoitukset rajattuna Tampereelle."/>
+            <wp:extent cx="4953000" cy="1600200"/>
+            <wp:effectExtent t="19050" r="19050" b="19050" l="19050"/>
+            <wp:docPr id="2" name="arc_addin_manager.png" descr="Project → Add-In Manager: asennettu suomenvaylat-lisäosa ja sen versio." title="Project → Add-In Manager: asennettu suomenvaylat-lisäosa ja sen versio."/>
             <wp:cNvGraphicFramePr>
               <a:graphicFrameLocks xmlns:a="http://schemas.openxmlformats.org/drawingml/2006/main" noChangeAspect="1"/>
             </wp:cNvGraphicFramePr>
@@ -2016,11 +687,17 @@
                   <pic:spPr bwMode="auto">
                     <a:xfrm>
                       <a:off x="0" y="0"/>
-                      <a:ext cx="4476750" cy="4914900"/>
+                      <a:ext cx="4953000" cy="1600200"/>
                     </a:xfrm>
                     <a:prstGeom prst="rect">
                       <a:avLst/>
                     </a:prstGeom>
+                    <a:noFill/>
+                    <a:ln>
+                      <a:solidFill>
+                        <a:srgbClr val="BFBFBF"/>
+                      </a:solidFill>
+                    </a:ln>
                   </pic:spPr>
                 </pic:pic>
               </a:graphicData>
@@ -2031,7 +708,7 @@
     </w:p>
     <w:p>
       <w:pPr>
-        <w:spacing w:after="200"/>
+        <w:spacing w:after="200" w:before="60"/>
         <w:jc w:val="center"/>
       </w:pPr>
       <w:r>
@@ -2042,90 +719,804 @@
           <w:sz w:val="18"/>
           <w:szCs w:val="18"/>
         </w:rPr>
-        <w:t xml:space="preserve">Kuva 1. Hae aineistoja: Väylän ja DigiRoadin nopeusrajoitukset rajattuna Tampereelle.</w:t>
-      </w:r>
-    </w:p>
-    <w:p>
-      <w:pPr>
+        <w:t xml:space="preserve">Kuva 2. Project → Add-In Manager: asennettu suomenvaylat-lisäosa ja sen versio.</w:t>
+      </w:r>
+    </w:p>
+    <w:p>
+      <w:pPr>
+        <w:pStyle w:val="Heading2"/>
         <w:keepNext/>
-        <w:spacing w:after="60" w:before="120"/>
-        <w:jc w:val="center"/>
-      </w:pPr>
-      <w:r>
-        <w:drawing>
-          <wp:inline distT="0" distB="0" distL="0" distR="0">
-            <wp:extent cx="4095750" cy="1847850"/>
-            <wp:effectExtent t="0" r="0" b="0" l="0"/>
-            <wp:docPr id="4" name="qgis_01b_credentials_crop.png" descr="Kuva 2. Tunnuskenttä näkyy vain, kun valittu lähde (tässä MML) tarvitsee avaimen." title="Kuva 2. Tunnuskenttä näkyy vain, kun valittu lähde (tässä MML) tarvitsee avaimen."/>
-            <wp:cNvGraphicFramePr>
-              <a:graphicFrameLocks xmlns:a="http://schemas.openxmlformats.org/drawingml/2006/main" noChangeAspect="1"/>
-            </wp:cNvGraphicFramePr>
-            <a:graphic xmlns:a="http://schemas.openxmlformats.org/drawingml/2006/main">
-              <a:graphicData uri="http://schemas.openxmlformats.org/drawingml/2006/picture">
-                <pic:pic xmlns:pic="http://schemas.openxmlformats.org/drawingml/2006/picture">
-                  <pic:nvPicPr>
-                    <pic:cNvPr id="0" name="" descr=""/>
-                    <pic:cNvPicPr>
-                      <a:picLocks noChangeAspect="1" noChangeArrowheads="1"/>
-                    </pic:cNvPicPr>
-                  </pic:nvPicPr>
-                  <pic:blipFill>
-                    <a:blip r:embed="rId10" cstate="none"/>
-                    <a:srcRect/>
-                    <a:stretch>
-                      <a:fillRect/>
-                    </a:stretch>
-                  </pic:blipFill>
-                  <pic:spPr bwMode="auto">
-                    <a:xfrm>
-                      <a:off x="0" y="0"/>
-                      <a:ext cx="4095750" cy="1847850"/>
-                    </a:xfrm>
-                    <a:prstGeom prst="rect">
-                      <a:avLst/>
-                    </a:prstGeom>
-                  </pic:spPr>
-                </pic:pic>
-              </a:graphicData>
-            </a:graphic>
-          </wp:inline>
-        </w:drawing>
-      </w:r>
-    </w:p>
-    <w:p>
-      <w:pPr>
-        <w:spacing w:after="200"/>
-        <w:jc w:val="center"/>
-      </w:pPr>
-      <w:r>
-        <w:rPr>
-          <w:i/>
-          <w:iCs/>
-          <w:color w:val="595959"/>
-          <w:sz w:val="18"/>
-          <w:szCs w:val="18"/>
-        </w:rPr>
-        <w:t xml:space="preserve">Kuva 2. Tunnuskenttä näkyy vain, kun valittu lähde (tässä MML) tarvitsee avaimen.</w:t>
-      </w:r>
-    </w:p>
-    <w:p>
-      <w:pPr>
-        <w:spacing w:after="120"/>
-      </w:pPr>
-      <w:r>
-        <w:t xml:space="preserve">Aineistot tallennetaan GeoPackage-tiedostoiksi koordinaatistossa </w:t>
-      </w:r>
-      <w:r>
-        <w:rPr>
-          <w:b/>
-          <w:bCs/>
-        </w:rPr>
-        <w:t xml:space="preserve">EPSG:3067</w:t>
-      </w:r>
-      <w:r>
-        <w:t xml:space="preserve"> (ETRS-TM35FIN) ja lisätään projektiin. Jos projektilla ei ole koordinaattijärjestelmää, lisäosa asettaa sen ensimmäisen ladatun tason mukaan.</w:t>
-      </w:r>
-    </w:p>
+      </w:pPr>
+      <w:r>
+        <w:t xml:space="preserve">1.2  Aineistojen lataus: Suomenväylät.fi</w:t>
+      </w:r>
+    </w:p>
+    <w:tbl>
+      <w:tblPr>
+        <w:tblW w:type="dxa" w:w="9638"/>
+        <w:tblBorders>
+          <w:top w:val="none" w:color="FFFFFF" w:sz="0"/>
+          <w:left w:val="none" w:color="FFFFFF" w:sz="0"/>
+          <w:bottom w:val="none" w:color="FFFFFF" w:sz="0"/>
+          <w:right w:val="none" w:color="FFFFFF" w:sz="0"/>
+          <w:insideH w:val="none" w:color="FFFFFF" w:sz="0"/>
+          <w:insideV w:val="none" w:color="FFFFFF" w:sz="0"/>
+        </w:tblBorders>
+        <w:tblLayout w:type="fixed"/>
+      </w:tblPr>
+      <w:tblGrid>
+        <w:gridCol w:w="4000"/>
+        <w:gridCol w:w="5638"/>
+      </w:tblGrid>
+      <w:tr>
+        <w:trPr>
+          <w:cantSplit/>
+        </w:trPr>
+        <w:tc>
+          <w:tcPr>
+            <w:tcW w:type="dxa" w:w="4000"/>
+            <w:tcBorders>
+              <w:top w:val="none" w:color="FFFFFF" w:sz="0"/>
+              <w:left w:val="none" w:color="FFFFFF" w:sz="0"/>
+              <w:bottom w:val="none" w:color="FFFFFF" w:sz="0"/>
+              <w:right w:val="none" w:color="FFFFFF" w:sz="0"/>
+            </w:tcBorders>
+            <w:tcMar>
+              <w:right w:type="dxa" w:w="200"/>
+            </w:tcMar>
+          </w:tcPr>
+          <w:p>
+            <w:pPr>
+              <w:jc w:val="center"/>
+            </w:pPr>
+            <w:r>
+              <w:drawing>
+                <wp:inline distT="0" distB="0" distL="0" distR="0">
+                  <wp:extent cx="2238375" cy="4200525"/>
+                  <wp:effectExtent t="19050" r="19050" b="19050" l="19050"/>
+                  <wp:docPr id="3" name="arc_tool.png" descr="Suomenväylät.fi-työkalu: kaksi Väylän tasoa rajattuna Kanta-Hämeeseen." title="Suomenväylät.fi-työkalu: kaksi Väylän tasoa rajattuna Kanta-Hämeeseen."/>
+                  <wp:cNvGraphicFramePr>
+                    <a:graphicFrameLocks xmlns:a="http://schemas.openxmlformats.org/drawingml/2006/main" noChangeAspect="1"/>
+                  </wp:cNvGraphicFramePr>
+                  <a:graphic xmlns:a="http://schemas.openxmlformats.org/drawingml/2006/main">
+                    <a:graphicData uri="http://schemas.openxmlformats.org/drawingml/2006/picture">
+                      <pic:pic xmlns:pic="http://schemas.openxmlformats.org/drawingml/2006/picture">
+                        <pic:nvPicPr>
+                          <pic:cNvPr id="0" name="" descr=""/>
+                          <pic:cNvPicPr>
+                            <a:picLocks noChangeAspect="1" noChangeArrowheads="1"/>
+                          </pic:cNvPicPr>
+                        </pic:nvPicPr>
+                        <pic:blipFill>
+                          <a:blip r:embed="rId10" cstate="none"/>
+                          <a:srcRect/>
+                          <a:stretch>
+                            <a:fillRect/>
+                          </a:stretch>
+                        </pic:blipFill>
+                        <pic:spPr bwMode="auto">
+                          <a:xfrm>
+                            <a:off x="0" y="0"/>
+                            <a:ext cx="2238375" cy="4200525"/>
+                          </a:xfrm>
+                          <a:prstGeom prst="rect">
+                            <a:avLst/>
+                          </a:prstGeom>
+                          <a:noFill/>
+                          <a:ln>
+                            <a:solidFill>
+                              <a:srgbClr val="BFBFBF"/>
+                            </a:solidFill>
+                          </a:ln>
+                        </pic:spPr>
+                      </pic:pic>
+                    </a:graphicData>
+                  </a:graphic>
+                </wp:inline>
+              </w:drawing>
+            </w:r>
+          </w:p>
+          <w:p>
+            <w:pPr>
+              <w:spacing w:after="200" w:before="60"/>
+              <w:jc w:val="center"/>
+            </w:pPr>
+            <w:r>
+              <w:rPr>
+                <w:i/>
+                <w:iCs/>
+                <w:color w:val="595959"/>
+                <w:sz w:val="18"/>
+                <w:szCs w:val="18"/>
+              </w:rPr>
+              <w:t xml:space="preserve">Kuva 3. Suomenväylät.fi-työkalu: kaksi Väylän tasoa rajattuna Kanta-Hämeeseen.</w:t>
+            </w:r>
+          </w:p>
+        </w:tc>
+        <w:tc>
+          <w:tcPr>
+            <w:tcW w:type="dxa" w:w="5638"/>
+            <w:tcBorders>
+              <w:top w:val="none" w:color="FFFFFF" w:sz="0"/>
+              <w:left w:val="none" w:color="FFFFFF" w:sz="0"/>
+              <w:bottom w:val="none" w:color="FFFFFF" w:sz="0"/>
+              <w:right w:val="none" w:color="FFFFFF" w:sz="0"/>
+            </w:tcBorders>
+            <w:tcMar>
+              <w:left w:type="dxa" w:w="100"/>
+            </w:tcMar>
+          </w:tcPr>
+          <w:p>
+            <w:pPr>
+              <w:pStyle w:val="ListParagraph"/>
+              <w:numPr>
+                <w:ilvl w:val="0"/>
+                <w:numId w:val="4"/>
+              </w:numPr>
+              <w:spacing w:after="80"/>
+            </w:pPr>
+            <w:r>
+              <w:t xml:space="preserve">Valitse </w:t>
+            </w:r>
+            <w:r>
+              <w:rPr>
+                <w:b/>
+                <w:bCs/>
+              </w:rPr>
+              <w:t xml:space="preserve">Add-In → Suomenväylät.fi</w:t>
+            </w:r>
+            <w:r>
+              <w:t xml:space="preserve">. Työkalu avautuu Geoprocessing-paneeliin.</w:t>
+            </w:r>
+          </w:p>
+          <w:p>
+            <w:pPr>
+              <w:pStyle w:val="ListParagraph"/>
+              <w:numPr>
+                <w:ilvl w:val="0"/>
+                <w:numId w:val="4"/>
+              </w:numPr>
+              <w:spacing w:after="80"/>
+            </w:pPr>
+            <w:r>
+              <w:rPr>
+                <w:b/>
+                <w:bCs/>
+              </w:rPr>
+              <w:t xml:space="preserve">Valitse rajapinnat:</w:t>
+            </w:r>
+            <w:r>
+              <w:t xml:space="preserve"> valitse yksi tai useampi lähde. Väylä on valittuna oletuksena.</w:t>
+            </w:r>
+          </w:p>
+          <w:p>
+            <w:pPr>
+              <w:pStyle w:val="ListParagraph"/>
+              <w:numPr>
+                <w:ilvl w:val="0"/>
+                <w:numId w:val="4"/>
+              </w:numPr>
+              <w:spacing w:after="80"/>
+            </w:pPr>
+            <w:r>
+              <w:t xml:space="preserve">Rajaa pitkää tasoluetteloa kentässä </w:t>
+            </w:r>
+            <w:r>
+              <w:rPr>
+                <w:b/>
+                <w:bCs/>
+              </w:rPr>
+              <w:t xml:space="preserve">Suodata tasoja kirjoittamalla</w:t>
+            </w:r>
+            <w:r>
+              <w:t xml:space="preserve">, esimerkiksi hakusanalla nopeus.</w:t>
+            </w:r>
+          </w:p>
+          <w:p>
+            <w:pPr>
+              <w:pStyle w:val="ListParagraph"/>
+              <w:numPr>
+                <w:ilvl w:val="0"/>
+                <w:numId w:val="4"/>
+              </w:numPr>
+              <w:spacing w:after="80"/>
+            </w:pPr>
+            <w:r>
+              <w:rPr>
+                <w:b/>
+                <w:bCs/>
+              </w:rPr>
+              <w:t xml:space="preserve">Valitse ladattavat aineistot:</w:t>
+            </w:r>
+            <w:r>
+              <w:t xml:space="preserve"> valitse tasot. Valinnat säilyvät, vaikka hakusanaa muutetaan.</w:t>
+            </w:r>
+          </w:p>
+          <w:p>
+            <w:pPr>
+              <w:pStyle w:val="ListParagraph"/>
+              <w:numPr>
+                <w:ilvl w:val="0"/>
+                <w:numId w:val="4"/>
+              </w:numPr>
+              <w:spacing w:after="80"/>
+            </w:pPr>
+            <w:r>
+              <w:rPr>
+                <w:b/>
+                <w:bCs/>
+              </w:rPr>
+              <w:t xml:space="preserve">Aluerajauksen taso:</w:t>
+            </w:r>
+            <w:r>
+              <w:t xml:space="preserve"> valitse Koko Suomi, Elinvoimakeskus, Hyvinvointialue, Maakunta, Kunta/Kaupunki tai Oma aineisto (Polygon/Polyline). Valitse sitten alueet kentässä </w:t>
+            </w:r>
+            <w:r>
+              <w:rPr>
+                <w:b/>
+                <w:bCs/>
+              </w:rPr>
+              <w:t xml:space="preserve">Valitse alue</w:t>
+            </w:r>
+            <w:r>
+              <w:t xml:space="preserve"> tai oma taso kentässä </w:t>
+            </w:r>
+            <w:r>
+              <w:rPr>
+                <w:b/>
+                <w:bCs/>
+              </w:rPr>
+              <w:t xml:space="preserve">Oma rajausaineisto</w:t>
+            </w:r>
+            <w:r>
+              <w:t xml:space="preserve">.</w:t>
+            </w:r>
+          </w:p>
+          <w:p>
+            <w:pPr>
+              <w:pStyle w:val="ListParagraph"/>
+              <w:numPr>
+                <w:ilvl w:val="0"/>
+                <w:numId w:val="4"/>
+              </w:numPr>
+              <w:spacing w:after="80"/>
+            </w:pPr>
+            <w:r>
+              <w:rPr>
+                <w:b/>
+                <w:bCs/>
+              </w:rPr>
+              <w:t xml:space="preserve">Tallennuskohde:</w:t>
+            </w:r>
+            <w:r>
+              <w:t xml:space="preserve"> oletuksena projektin geodatabase. Voit valita myös muun GDB:n tai kansion.</w:t>
+            </w:r>
+          </w:p>
+          <w:p>
+            <w:pPr>
+              <w:pStyle w:val="ListParagraph"/>
+              <w:numPr>
+                <w:ilvl w:val="0"/>
+                <w:numId w:val="4"/>
+              </w:numPr>
+              <w:spacing w:after="80"/>
+            </w:pPr>
+            <w:r>
+              <w:t xml:space="preserve">Jos lähde vaatii tunnuksen, täytä vastaava kenttä (ks. luku 3).</w:t>
+            </w:r>
+          </w:p>
+          <w:p>
+            <w:pPr>
+              <w:pStyle w:val="ListParagraph"/>
+              <w:numPr>
+                <w:ilvl w:val="0"/>
+                <w:numId w:val="4"/>
+              </w:numPr>
+              <w:spacing w:after="80"/>
+            </w:pPr>
+            <w:r>
+              <w:t xml:space="preserve">Valitse </w:t>
+            </w:r>
+            <w:r>
+              <w:rPr>
+                <w:b/>
+                <w:bCs/>
+              </w:rPr>
+              <w:t xml:space="preserve">Run</w:t>
+            </w:r>
+            <w:r>
+              <w:t xml:space="preserve">. Valmiit tasot lisätään aktiiviseen karttaan. Etenemistä voi seurata kohdasta </w:t>
+            </w:r>
+            <w:r>
+              <w:rPr>
+                <w:b/>
+                <w:bCs/>
+              </w:rPr>
+              <w:t xml:space="preserve">View Details → Messages</w:t>
+            </w:r>
+            <w:r>
+              <w:t xml:space="preserve">.</w:t>
+            </w:r>
+          </w:p>
+        </w:tc>
+      </w:tr>
+    </w:tbl>
+    <w:p>
+      <w:pPr>
+        <w:spacing w:after="60"/>
+      </w:pPr>
+    </w:p>
+    <w:tbl>
+      <w:tblPr>
+        <w:tblW w:type="dxa" w:w="9638"/>
+        <w:tblBorders>
+          <w:top w:val="single" w:color="auto" w:sz="4"/>
+          <w:left w:val="single" w:color="auto" w:sz="4"/>
+          <w:bottom w:val="single" w:color="auto" w:sz="4"/>
+          <w:right w:val="single" w:color="auto" w:sz="4"/>
+          <w:insideH w:val="single" w:color="auto" w:sz="4"/>
+          <w:insideV w:val="single" w:color="auto" w:sz="4"/>
+        </w:tblBorders>
+        <w:tblLayout w:type="fixed"/>
+      </w:tblPr>
+      <w:tblGrid>
+        <w:gridCol w:w="3300"/>
+        <w:gridCol w:w="6338"/>
+      </w:tblGrid>
+      <w:tr>
+        <w:trPr>
+          <w:tblHeader/>
+        </w:trPr>
+        <w:tc>
+          <w:tcPr>
+            <w:tcW w:type="dxa" w:w="3300"/>
+            <w:tcBorders>
+              <w:top w:val="single" w:color="BFBFBF" w:sz="4"/>
+              <w:left w:val="single" w:color="BFBFBF" w:sz="4"/>
+              <w:bottom w:val="single" w:color="BFBFBF" w:sz="4"/>
+              <w:right w:val="single" w:color="BFBFBF" w:sz="4"/>
+            </w:tcBorders>
+            <w:shd w:fill="1F4E79" w:color="auto" w:val="clear"/>
+            <w:tcMar>
+              <w:top w:type="dxa" w:w="60"/>
+              <w:left w:type="dxa" w:w="100"/>
+              <w:bottom w:type="dxa" w:w="60"/>
+              <w:right w:type="dxa" w:w="100"/>
+            </w:tcMar>
+          </w:tcPr>
+          <w:p>
+            <w:r>
+              <w:rPr>
+                <w:b/>
+                <w:bCs/>
+                <w:color w:val="FFFFFF"/>
+              </w:rPr>
+              <w:t xml:space="preserve">Kenttä</w:t>
+            </w:r>
+          </w:p>
+        </w:tc>
+        <w:tc>
+          <w:tcPr>
+            <w:tcW w:type="dxa" w:w="6338"/>
+            <w:tcBorders>
+              <w:top w:val="single" w:color="BFBFBF" w:sz="4"/>
+              <w:left w:val="single" w:color="BFBFBF" w:sz="4"/>
+              <w:bottom w:val="single" w:color="BFBFBF" w:sz="4"/>
+              <w:right w:val="single" w:color="BFBFBF" w:sz="4"/>
+            </w:tcBorders>
+            <w:shd w:fill="1F4E79" w:color="auto" w:val="clear"/>
+            <w:tcMar>
+              <w:top w:type="dxa" w:w="60"/>
+              <w:left w:type="dxa" w:w="100"/>
+              <w:bottom w:type="dxa" w:w="60"/>
+              <w:right w:type="dxa" w:w="100"/>
+            </w:tcMar>
+          </w:tcPr>
+          <w:p>
+            <w:r>
+              <w:rPr>
+                <w:b/>
+                <w:bCs/>
+                <w:color w:val="FFFFFF"/>
+              </w:rPr>
+              <w:t xml:space="preserve">Mitä se tekee</w:t>
+            </w:r>
+          </w:p>
+        </w:tc>
+      </w:tr>
+      <w:tr>
+        <w:trPr>
+          <w:cantSplit/>
+        </w:trPr>
+        <w:tc>
+          <w:tcPr>
+            <w:tcW w:type="dxa" w:w="3300"/>
+            <w:tcBorders>
+              <w:top w:val="single" w:color="BFBFBF" w:sz="4"/>
+              <w:left w:val="single" w:color="BFBFBF" w:sz="4"/>
+              <w:bottom w:val="single" w:color="BFBFBF" w:sz="4"/>
+              <w:right w:val="single" w:color="BFBFBF" w:sz="4"/>
+            </w:tcBorders>
+            <w:tcMar>
+              <w:top w:type="dxa" w:w="60"/>
+              <w:left w:type="dxa" w:w="100"/>
+              <w:bottom w:type="dxa" w:w="60"/>
+              <w:right w:type="dxa" w:w="100"/>
+            </w:tcMar>
+          </w:tcPr>
+          <w:p>
+            <w:r>
+              <w:t xml:space="preserve">Valitse rajapinnat</w:t>
+            </w:r>
+          </w:p>
+        </w:tc>
+        <w:tc>
+          <w:tcPr>
+            <w:tcW w:type="dxa" w:w="6338"/>
+            <w:tcBorders>
+              <w:top w:val="single" w:color="BFBFBF" w:sz="4"/>
+              <w:left w:val="single" w:color="BFBFBF" w:sz="4"/>
+              <w:bottom w:val="single" w:color="BFBFBF" w:sz="4"/>
+              <w:right w:val="single" w:color="BFBFBF" w:sz="4"/>
+            </w:tcBorders>
+            <w:tcMar>
+              <w:top w:type="dxa" w:w="60"/>
+              <w:left w:type="dxa" w:w="100"/>
+              <w:bottom w:type="dxa" w:w="60"/>
+              <w:right w:type="dxa" w:w="100"/>
+            </w:tcMar>
+          </w:tcPr>
+          <w:p>
+            <w:r>
+              <w:t xml:space="preserve">Tietolähteet, joista tasot haetaan. Voit valita useita.</w:t>
+            </w:r>
+          </w:p>
+        </w:tc>
+      </w:tr>
+      <w:tr>
+        <w:trPr>
+          <w:cantSplit/>
+        </w:trPr>
+        <w:tc>
+          <w:tcPr>
+            <w:tcW w:type="dxa" w:w="3300"/>
+            <w:tcBorders>
+              <w:top w:val="single" w:color="BFBFBF" w:sz="4"/>
+              <w:left w:val="single" w:color="BFBFBF" w:sz="4"/>
+              <w:bottom w:val="single" w:color="BFBFBF" w:sz="4"/>
+              <w:right w:val="single" w:color="BFBFBF" w:sz="4"/>
+            </w:tcBorders>
+            <w:tcMar>
+              <w:top w:type="dxa" w:w="60"/>
+              <w:left w:type="dxa" w:w="100"/>
+              <w:bottom w:type="dxa" w:w="60"/>
+              <w:right w:type="dxa" w:w="100"/>
+            </w:tcMar>
+          </w:tcPr>
+          <w:p>
+            <w:r>
+              <w:t xml:space="preserve">Suodata tasoja kirjoittamalla</w:t>
+            </w:r>
+          </w:p>
+        </w:tc>
+        <w:tc>
+          <w:tcPr>
+            <w:tcW w:type="dxa" w:w="6338"/>
+            <w:tcBorders>
+              <w:top w:val="single" w:color="BFBFBF" w:sz="4"/>
+              <w:left w:val="single" w:color="BFBFBF" w:sz="4"/>
+              <w:bottom w:val="single" w:color="BFBFBF" w:sz="4"/>
+              <w:right w:val="single" w:color="BFBFBF" w:sz="4"/>
+            </w:tcBorders>
+            <w:tcMar>
+              <w:top w:type="dxa" w:w="60"/>
+              <w:left w:type="dxa" w:w="100"/>
+              <w:bottom w:type="dxa" w:w="60"/>
+              <w:right w:type="dxa" w:w="100"/>
+            </w:tcMar>
+          </w:tcPr>
+          <w:p>
+            <w:r>
+              <w:t xml:space="preserve">Näyttää vain tasot, joiden nimessä on hakusana.</w:t>
+            </w:r>
+          </w:p>
+        </w:tc>
+      </w:tr>
+      <w:tr>
+        <w:trPr>
+          <w:cantSplit/>
+        </w:trPr>
+        <w:tc>
+          <w:tcPr>
+            <w:tcW w:type="dxa" w:w="3300"/>
+            <w:tcBorders>
+              <w:top w:val="single" w:color="BFBFBF" w:sz="4"/>
+              <w:left w:val="single" w:color="BFBFBF" w:sz="4"/>
+              <w:bottom w:val="single" w:color="BFBFBF" w:sz="4"/>
+              <w:right w:val="single" w:color="BFBFBF" w:sz="4"/>
+            </w:tcBorders>
+            <w:tcMar>
+              <w:top w:type="dxa" w:w="60"/>
+              <w:left w:type="dxa" w:w="100"/>
+              <w:bottom w:type="dxa" w:w="60"/>
+              <w:right w:type="dxa" w:w="100"/>
+            </w:tcMar>
+          </w:tcPr>
+          <w:p>
+            <w:r>
+              <w:t xml:space="preserve">Valitse ladattavat aineistot</w:t>
+            </w:r>
+          </w:p>
+        </w:tc>
+        <w:tc>
+          <w:tcPr>
+            <w:tcW w:type="dxa" w:w="6338"/>
+            <w:tcBorders>
+              <w:top w:val="single" w:color="BFBFBF" w:sz="4"/>
+              <w:left w:val="single" w:color="BFBFBF" w:sz="4"/>
+              <w:bottom w:val="single" w:color="BFBFBF" w:sz="4"/>
+              <w:right w:val="single" w:color="BFBFBF" w:sz="4"/>
+            </w:tcBorders>
+            <w:tcMar>
+              <w:top w:type="dxa" w:w="60"/>
+              <w:left w:type="dxa" w:w="100"/>
+              <w:bottom w:type="dxa" w:w="60"/>
+              <w:right w:type="dxa" w:w="100"/>
+            </w:tcMar>
+          </w:tcPr>
+          <w:p>
+            <w:r>
+              <w:t xml:space="preserve">Ladattavat tasot. Luettelo muodostetaan palveluiden ajantasaisista tiedoista.</w:t>
+            </w:r>
+          </w:p>
+        </w:tc>
+      </w:tr>
+      <w:tr>
+        <w:trPr>
+          <w:cantSplit/>
+        </w:trPr>
+        <w:tc>
+          <w:tcPr>
+            <w:tcW w:type="dxa" w:w="3300"/>
+            <w:tcBorders>
+              <w:top w:val="single" w:color="BFBFBF" w:sz="4"/>
+              <w:left w:val="single" w:color="BFBFBF" w:sz="4"/>
+              <w:bottom w:val="single" w:color="BFBFBF" w:sz="4"/>
+              <w:right w:val="single" w:color="BFBFBF" w:sz="4"/>
+            </w:tcBorders>
+            <w:tcMar>
+              <w:top w:type="dxa" w:w="60"/>
+              <w:left w:type="dxa" w:w="100"/>
+              <w:bottom w:type="dxa" w:w="60"/>
+              <w:right w:type="dxa" w:w="100"/>
+            </w:tcMar>
+          </w:tcPr>
+          <w:p>
+            <w:r>
+              <w:t xml:space="preserve">Aluerajauksen taso / Valitse alue</w:t>
+            </w:r>
+          </w:p>
+        </w:tc>
+        <w:tc>
+          <w:tcPr>
+            <w:tcW w:type="dxa" w:w="6338"/>
+            <w:tcBorders>
+              <w:top w:val="single" w:color="BFBFBF" w:sz="4"/>
+              <w:left w:val="single" w:color="BFBFBF" w:sz="4"/>
+              <w:bottom w:val="single" w:color="BFBFBF" w:sz="4"/>
+              <w:right w:val="single" w:color="BFBFBF" w:sz="4"/>
+            </w:tcBorders>
+            <w:tcMar>
+              <w:top w:type="dxa" w:w="60"/>
+              <w:left w:type="dxa" w:w="100"/>
+              <w:bottom w:type="dxa" w:w="60"/>
+              <w:right w:type="dxa" w:w="100"/>
+            </w:tcMar>
+          </w:tcPr>
+          <w:p>
+            <w:r>
+              <w:t xml:space="preserve">Hallinnollinen rajaus. Koko Suomi ei vaadi aluevalintaa.</w:t>
+            </w:r>
+          </w:p>
+        </w:tc>
+      </w:tr>
+      <w:tr>
+        <w:trPr>
+          <w:cantSplit/>
+        </w:trPr>
+        <w:tc>
+          <w:tcPr>
+            <w:tcW w:type="dxa" w:w="3300"/>
+            <w:tcBorders>
+              <w:top w:val="single" w:color="BFBFBF" w:sz="4"/>
+              <w:left w:val="single" w:color="BFBFBF" w:sz="4"/>
+              <w:bottom w:val="single" w:color="BFBFBF" w:sz="4"/>
+              <w:right w:val="single" w:color="BFBFBF" w:sz="4"/>
+            </w:tcBorders>
+            <w:tcMar>
+              <w:top w:type="dxa" w:w="60"/>
+              <w:left w:type="dxa" w:w="100"/>
+              <w:bottom w:type="dxa" w:w="60"/>
+              <w:right w:type="dxa" w:w="100"/>
+            </w:tcMar>
+          </w:tcPr>
+          <w:p>
+            <w:r>
+              <w:t xml:space="preserve">Oma rajausaineisto</w:t>
+            </w:r>
+          </w:p>
+        </w:tc>
+        <w:tc>
+          <w:tcPr>
+            <w:tcW w:type="dxa" w:w="6338"/>
+            <w:tcBorders>
+              <w:top w:val="single" w:color="BFBFBF" w:sz="4"/>
+              <w:left w:val="single" w:color="BFBFBF" w:sz="4"/>
+              <w:bottom w:val="single" w:color="BFBFBF" w:sz="4"/>
+              <w:right w:val="single" w:color="BFBFBF" w:sz="4"/>
+            </w:tcBorders>
+            <w:tcMar>
+              <w:top w:type="dxa" w:w="60"/>
+              <w:left w:type="dxa" w:w="100"/>
+              <w:bottom w:type="dxa" w:w="60"/>
+              <w:right w:type="dxa" w:w="100"/>
+            </w:tcMar>
+          </w:tcPr>
+          <w:p>
+            <w:r>
+              <w:t xml:space="preserve">Kartan polygon- tai viivataso omaa rajausta varten.</w:t>
+            </w:r>
+          </w:p>
+        </w:tc>
+      </w:tr>
+      <w:tr>
+        <w:trPr>
+          <w:cantSplit/>
+        </w:trPr>
+        <w:tc>
+          <w:tcPr>
+            <w:tcW w:type="dxa" w:w="3300"/>
+            <w:tcBorders>
+              <w:top w:val="single" w:color="BFBFBF" w:sz="4"/>
+              <w:left w:val="single" w:color="BFBFBF" w:sz="4"/>
+              <w:bottom w:val="single" w:color="BFBFBF" w:sz="4"/>
+              <w:right w:val="single" w:color="BFBFBF" w:sz="4"/>
+            </w:tcBorders>
+            <w:tcMar>
+              <w:top w:type="dxa" w:w="60"/>
+              <w:left w:type="dxa" w:w="100"/>
+              <w:bottom w:type="dxa" w:w="60"/>
+              <w:right w:type="dxa" w:w="100"/>
+            </w:tcMar>
+          </w:tcPr>
+          <w:p>
+            <w:r>
+              <w:t xml:space="preserve">Tallennuskohde (GDB tai kansio)</w:t>
+            </w:r>
+          </w:p>
+        </w:tc>
+        <w:tc>
+          <w:tcPr>
+            <w:tcW w:type="dxa" w:w="6338"/>
+            <w:tcBorders>
+              <w:top w:val="single" w:color="BFBFBF" w:sz="4"/>
+              <w:left w:val="single" w:color="BFBFBF" w:sz="4"/>
+              <w:bottom w:val="single" w:color="BFBFBF" w:sz="4"/>
+              <w:right w:val="single" w:color="BFBFBF" w:sz="4"/>
+            </w:tcBorders>
+            <w:tcMar>
+              <w:top w:type="dxa" w:w="60"/>
+              <w:left w:type="dxa" w:w="100"/>
+              <w:bottom w:type="dxa" w:w="60"/>
+              <w:right w:type="dxa" w:w="100"/>
+            </w:tcMar>
+          </w:tcPr>
+          <w:p>
+            <w:r>
+              <w:t xml:space="preserve">Kohde, johon valmiit tasot tallennetaan.</w:t>
+            </w:r>
+          </w:p>
+        </w:tc>
+      </w:tr>
+      <w:tr>
+        <w:trPr>
+          <w:cantSplit/>
+        </w:trPr>
+        <w:tc>
+          <w:tcPr>
+            <w:tcW w:type="dxa" w:w="3300"/>
+            <w:tcBorders>
+              <w:top w:val="single" w:color="BFBFBF" w:sz="4"/>
+              <w:left w:val="single" w:color="BFBFBF" w:sz="4"/>
+              <w:bottom w:val="single" w:color="BFBFBF" w:sz="4"/>
+              <w:right w:val="single" w:color="BFBFBF" w:sz="4"/>
+            </w:tcBorders>
+            <w:tcMar>
+              <w:top w:type="dxa" w:w="60"/>
+              <w:left w:type="dxa" w:w="100"/>
+              <w:bottom w:type="dxa" w:w="60"/>
+              <w:right w:type="dxa" w:w="100"/>
+            </w:tcMar>
+          </w:tcPr>
+          <w:p>
+            <w:r>
+              <w:t xml:space="preserve">Päivitä tasolistaus palvelusta</w:t>
+            </w:r>
+          </w:p>
+        </w:tc>
+        <w:tc>
+          <w:tcPr>
+            <w:tcW w:type="dxa" w:w="6338"/>
+            <w:tcBorders>
+              <w:top w:val="single" w:color="BFBFBF" w:sz="4"/>
+              <w:left w:val="single" w:color="BFBFBF" w:sz="4"/>
+              <w:bottom w:val="single" w:color="BFBFBF" w:sz="4"/>
+              <w:right w:val="single" w:color="BFBFBF" w:sz="4"/>
+            </w:tcBorders>
+            <w:tcMar>
+              <w:top w:type="dxa" w:w="60"/>
+              <w:left w:type="dxa" w:w="100"/>
+              <w:bottom w:type="dxa" w:w="60"/>
+              <w:right w:type="dxa" w:w="100"/>
+            </w:tcMar>
+          </w:tcPr>
+          <w:p>
+            <w:r>
+              <w:t xml:space="preserve">Hakee tasoluettelon uudelleen ohi 24 tunnin välimuistin. Käytä, jos uusi taso puuttuu luettelosta.</w:t>
+            </w:r>
+          </w:p>
+        </w:tc>
+      </w:tr>
+      <w:tr>
+        <w:trPr>
+          <w:cantSplit/>
+        </w:trPr>
+        <w:tc>
+          <w:tcPr>
+            <w:tcW w:type="dxa" w:w="3300"/>
+            <w:tcBorders>
+              <w:top w:val="single" w:color="BFBFBF" w:sz="4"/>
+              <w:left w:val="single" w:color="BFBFBF" w:sz="4"/>
+              <w:bottom w:val="single" w:color="BFBFBF" w:sz="4"/>
+              <w:right w:val="single" w:color="BFBFBF" w:sz="4"/>
+            </w:tcBorders>
+            <w:tcMar>
+              <w:top w:type="dxa" w:w="60"/>
+              <w:left w:type="dxa" w:w="100"/>
+              <w:bottom w:type="dxa" w:w="60"/>
+              <w:right w:type="dxa" w:w="100"/>
+            </w:tcMar>
+          </w:tcPr>
+          <w:p>
+            <w:r>
+              <w:t xml:space="preserve">API-avaimet, tunnukset, Aino-token</w:t>
+            </w:r>
+          </w:p>
+        </w:tc>
+        <w:tc>
+          <w:tcPr>
+            <w:tcW w:type="dxa" w:w="6338"/>
+            <w:tcBorders>
+              <w:top w:val="single" w:color="BFBFBF" w:sz="4"/>
+              <w:left w:val="single" w:color="BFBFBF" w:sz="4"/>
+              <w:bottom w:val="single" w:color="BFBFBF" w:sz="4"/>
+              <w:right w:val="single" w:color="BFBFBF" w:sz="4"/>
+            </w:tcBorders>
+            <w:tcMar>
+              <w:top w:type="dxa" w:w="60"/>
+              <w:left w:type="dxa" w:w="100"/>
+              <w:bottom w:type="dxa" w:w="60"/>
+              <w:right w:type="dxa" w:w="100"/>
+            </w:tcMar>
+          </w:tcPr>
+          <w:p>
+            <w:r>
+              <w:t xml:space="preserve">Tarvitaan vain tietyissä lähteissä. Avaimet tallennetaan salattuina.</w:t>
+            </w:r>
+          </w:p>
+        </w:tc>
+      </w:tr>
+    </w:tbl>
     <w:p>
       <w:pPr>
         <w:pBdr>
@@ -2144,7 +1535,7 @@
         <w:t xml:space="preserve">Hyvä tietää: </w:t>
       </w:r>
       <w:r>
-        <w:t xml:space="preserve">Väylän, DigiRoadin ja Tilastokeskuksen kohteet tallennetaan kokonaisina, jos ne osuvat rajaukseen. Muiden lähteiden aineistot leikataan rajauksen muotoon. Live-karttatasoille (esim. Aino WMS ja MML Karttakuva) ei tarvita rajausta eikä tallennuskansiota.</w:t>
+        <w:t xml:space="preserve">Väylän ja DigiRoadin kohteet tallennetaan kokonaisina, jos ne leikkaavat rajausta. Muiden lähteiden aineistot leikataan rajauksen muotoon. Mitä pienempi rajaus ja mitä vähemmän tasoja, sitä nopeampi lataus.</w:t>
       </w:r>
     </w:p>
     <w:p>
@@ -2153,21 +1544,186 @@
         <w:keepNext/>
       </w:pPr>
       <w:r>
-        <w:t xml:space="preserve">2.3  Taustakartta: Lisää taustakartta</w:t>
+        <w:t xml:space="preserve">1.3  Taustakartat (MML/Kapsi)</w:t>
       </w:r>
     </w:p>
     <w:p>
       <w:pPr>
         <w:keepNext/>
-        <w:spacing w:after="60" w:before="120"/>
+        <w:spacing w:after="120"/>
+      </w:pPr>
+      <w:r>
+        <w:t xml:space="preserve">Taustakarttatyökalu on samassa työkalupakissa kuin Suomenväylät.fi. Lisää työkalupakki projektiin kerran:</w:t>
+      </w:r>
+    </w:p>
+    <w:p>
+      <w:pPr>
+        <w:pStyle w:val="ListParagraph"/>
+        <w:numPr>
+          <w:ilvl w:val="0"/>
+          <w:numId w:val="5"/>
+        </w:numPr>
+        <w:spacing w:after="80"/>
+      </w:pPr>
+      <w:r>
+        <w:t xml:space="preserve">Avaa </w:t>
+      </w:r>
+      <w:r>
+        <w:rPr>
+          <w:b/>
+          <w:bCs/>
+        </w:rPr>
+        <w:t xml:space="preserve">Catalog</w:t>
+      </w:r>
+      <w:r>
+        <w:t xml:space="preserve">-paneeli tai -näkymä. Napsauta </w:t>
+      </w:r>
+      <w:r>
+        <w:rPr>
+          <w:b/>
+          <w:bCs/>
+        </w:rPr>
+        <w:t xml:space="preserve">Project → Toolboxes</w:t>
+      </w:r>
+      <w:r>
+        <w:t xml:space="preserve"> -kohtaa hiiren oikealla painikkeella ja valitse </w:t>
+      </w:r>
+      <w:r>
+        <w:rPr>
+          <w:b/>
+          <w:bCs/>
+        </w:rPr>
+        <w:t xml:space="preserve">Add Toolbox</w:t>
+      </w:r>
+      <w:r>
+        <w:t xml:space="preserve">.</w:t>
+      </w:r>
+    </w:p>
+    <w:p>
+      <w:pPr>
+        <w:pStyle w:val="ListParagraph"/>
+        <w:numPr>
+          <w:ilvl w:val="0"/>
+          <w:numId w:val="5"/>
+        </w:numPr>
+        <w:spacing w:after="80"/>
+      </w:pPr>
+      <w:r>
+        <w:t xml:space="preserve">Kirjoita ikkunan </w:t>
+      </w:r>
+      <w:r>
+        <w:rPr>
+          <w:b/>
+          <w:bCs/>
+        </w:rPr>
+        <w:t xml:space="preserve">Name</w:t>
+      </w:r>
+      <w:r>
+        <w:t xml:space="preserve">-kenttään alla oleva polku, vaihda &lt;käyttäjätunnus&gt; omaksi Windows-tunnukseksesi ja paina Enter. Muotoa %LOCALAPPDATA% ikkuna ei hyväksy.</w:t>
+      </w:r>
+    </w:p>
+    <w:p>
+      <w:pPr>
+        <w:spacing w:after="120" w:before="60"/>
+        <w:ind w:left="426"/>
+      </w:pPr>
+      <w:r>
+        <w:rPr>
+          <w:rFonts w:ascii="Consolas" w:cs="Consolas" w:eastAsia="Consolas" w:hAnsi="Consolas"/>
+          <w:sz w:val="18"/>
+          <w:szCs w:val="18"/>
+        </w:rPr>
+        <w:t xml:space="preserve">C:\Users\&lt;käyttäjätunnus&gt;\AppData\Local\ESRI\ArcGISPro\AssemblyCache\{2aea3c93-c012-4ed4-b416-6b3a844e0204}\Toolboxes</w:t>
+      </w:r>
+    </w:p>
+    <w:p>
+      <w:pPr>
+        <w:pStyle w:val="ListParagraph"/>
+        <w:numPr>
+          <w:ilvl w:val="0"/>
+          <w:numId w:val="5"/>
+        </w:numPr>
+        <w:spacing w:after="80"/>
+      </w:pPr>
+      <w:r>
+        <w:t xml:space="preserve">Valitse </w:t>
+      </w:r>
+      <w:r>
+        <w:rPr>
+          <w:b/>
+          <w:bCs/>
+        </w:rPr>
+        <w:t xml:space="preserve">VaylaWFSDownloader.pyt</w:t>
+      </w:r>
+      <w:r>
+        <w:t xml:space="preserve"> ja </w:t>
+      </w:r>
+      <w:r>
+        <w:rPr>
+          <w:b/>
+          <w:bCs/>
+        </w:rPr>
+        <w:t xml:space="preserve">OK</w:t>
+      </w:r>
+      <w:r>
+        <w:t xml:space="preserve">.</w:t>
+      </w:r>
+    </w:p>
+    <w:p>
+      <w:pPr>
+        <w:pStyle w:val="ListParagraph"/>
+        <w:numPr>
+          <w:ilvl w:val="0"/>
+          <w:numId w:val="5"/>
+        </w:numPr>
+        <w:spacing w:after="80"/>
+      </w:pPr>
+      <w:r>
+        <w:t xml:space="preserve">Geoprocessing-paneelin </w:t>
+      </w:r>
+      <w:r>
+        <w:rPr>
+          <w:b/>
+          <w:bCs/>
+        </w:rPr>
+        <w:t xml:space="preserve">Toolboxes</w:t>
+      </w:r>
+      <w:r>
+        <w:t xml:space="preserve">-välilehdelle tulee projektin alle </w:t>
+      </w:r>
+      <w:r>
+        <w:rPr>
+          <w:b/>
+          <w:bCs/>
+        </w:rPr>
+        <w:t xml:space="preserve">Väylävirasto WFS Lataustyökalu</w:t>
+      </w:r>
+      <w:r>
+        <w:t xml:space="preserve">. Avaa siitä </w:t>
+      </w:r>
+      <w:r>
+        <w:rPr>
+          <w:b/>
+          <w:bCs/>
+        </w:rPr>
+        <w:t xml:space="preserve">Taustakartat (MML/Kapsi)</w:t>
+      </w:r>
+      <w:r>
+        <w:t xml:space="preserve">. Tallenna projekti, niin työkalupakki säilyy siinä.</w:t>
+      </w:r>
+    </w:p>
+    <w:p>
+      <w:pPr>
+        <w:keepNext/>
+        <w:spacing w:before="120"/>
         <w:jc w:val="center"/>
       </w:pPr>
       <w:r>
         <w:drawing>
           <wp:inline distT="0" distB="0" distL="0" distR="0">
-            <wp:extent cx="4476750" cy="1095375"/>
-            <wp:effectExtent t="0" r="0" b="0" l="0"/>
-            <wp:docPr id="5" name="qgis_03_background_crop.png" descr="Kuva 3. Lisää taustakartta -välilehti." title="Kuva 3. Lisää taustakartta -välilehti."/>
+            <wp:extent cx="3810000" cy="2562225"/>
+            <wp:effectExtent t="19050" r="19050" b="19050" l="19050"/>
+            <wp:docPr id="4" name="arc_addtoolbox_dialog.png" descr="Add Toolbox: valitse VaylaWFSDownloader.pyt." title="Add Toolbox: valitse VaylaWFSDownloader.pyt."/>
             <wp:cNvGraphicFramePr>
               <a:graphicFrameLocks xmlns:a="http://schemas.openxmlformats.org/drawingml/2006/main" noChangeAspect="1"/>
             </wp:cNvGraphicFramePr>
@@ -2190,11 +1746,17 @@
                   <pic:spPr bwMode="auto">
                     <a:xfrm>
                       <a:off x="0" y="0"/>
-                      <a:ext cx="4476750" cy="1095375"/>
+                      <a:ext cx="3810000" cy="2562225"/>
                     </a:xfrm>
                     <a:prstGeom prst="rect">
                       <a:avLst/>
                     </a:prstGeom>
+                    <a:noFill/>
+                    <a:ln>
+                      <a:solidFill>
+                        <a:srgbClr val="BFBFBF"/>
+                      </a:solidFill>
+                    </a:ln>
                   </pic:spPr>
                 </pic:pic>
               </a:graphicData>
@@ -2205,7 +1767,7 @@
     </w:p>
     <w:p>
       <w:pPr>
-        <w:spacing w:after="200"/>
+        <w:spacing w:after="200" w:before="60"/>
         <w:jc w:val="center"/>
       </w:pPr>
       <w:r>
@@ -2216,7 +1778,1075 @@
           <w:sz w:val="18"/>
           <w:szCs w:val="18"/>
         </w:rPr>
-        <w:t xml:space="preserve">Kuva 3. Lisää taustakartta -välilehti.</w:t>
+        <w:t xml:space="preserve">Kuva 4. Add Toolbox: valitse VaylaWFSDownloader.pyt.</w:t>
+      </w:r>
+    </w:p>
+    <w:tbl>
+      <w:tblPr>
+        <w:tblW w:type="dxa" w:w="9638"/>
+        <w:tblBorders>
+          <w:top w:val="none" w:color="FFFFFF" w:sz="0"/>
+          <w:left w:val="none" w:color="FFFFFF" w:sz="0"/>
+          <w:bottom w:val="none" w:color="FFFFFF" w:sz="0"/>
+          <w:right w:val="none" w:color="FFFFFF" w:sz="0"/>
+          <w:insideH w:val="none" w:color="FFFFFF" w:sz="0"/>
+          <w:insideV w:val="none" w:color="FFFFFF" w:sz="0"/>
+        </w:tblBorders>
+        <w:tblLayout w:type="fixed"/>
+      </w:tblPr>
+      <w:tblGrid>
+        <w:gridCol w:w="4819"/>
+        <w:gridCol w:w="4819"/>
+      </w:tblGrid>
+      <w:tr>
+        <w:trPr>
+          <w:cantSplit/>
+        </w:trPr>
+        <w:tc>
+          <w:tcPr>
+            <w:tcW w:type="dxa" w:w="4819"/>
+            <w:tcBorders>
+              <w:top w:val="none" w:color="FFFFFF" w:sz="0"/>
+              <w:left w:val="none" w:color="FFFFFF" w:sz="0"/>
+              <w:bottom w:val="none" w:color="FFFFFF" w:sz="0"/>
+              <w:right w:val="none" w:color="FFFFFF" w:sz="0"/>
+            </w:tcBorders>
+          </w:tcPr>
+          <w:p>
+            <w:pPr>
+              <w:jc w:val="center"/>
+            </w:pPr>
+            <w:r>
+              <w:drawing>
+                <wp:inline distT="0" distB="0" distL="0" distR="0">
+                  <wp:extent cx="2571750" cy="1381125"/>
+                  <wp:effectExtent t="19050" r="19050" b="19050" l="19050"/>
+                  <wp:docPr id="5" name="arc_toolbox_pane.png" descr="Työkalupakki projektin Toolboxes-listalla." title="Työkalupakki projektin Toolboxes-listalla."/>
+                  <wp:cNvGraphicFramePr>
+                    <a:graphicFrameLocks xmlns:a="http://schemas.openxmlformats.org/drawingml/2006/main" noChangeAspect="1"/>
+                  </wp:cNvGraphicFramePr>
+                  <a:graphic xmlns:a="http://schemas.openxmlformats.org/drawingml/2006/main">
+                    <a:graphicData uri="http://schemas.openxmlformats.org/drawingml/2006/picture">
+                      <pic:pic xmlns:pic="http://schemas.openxmlformats.org/drawingml/2006/picture">
+                        <pic:nvPicPr>
+                          <pic:cNvPr id="0" name="" descr=""/>
+                          <pic:cNvPicPr>
+                            <a:picLocks noChangeAspect="1" noChangeArrowheads="1"/>
+                          </pic:cNvPicPr>
+                        </pic:nvPicPr>
+                        <pic:blipFill>
+                          <a:blip r:embed="rId12" cstate="none"/>
+                          <a:srcRect/>
+                          <a:stretch>
+                            <a:fillRect/>
+                          </a:stretch>
+                        </pic:blipFill>
+                        <pic:spPr bwMode="auto">
+                          <a:xfrm>
+                            <a:off x="0" y="0"/>
+                            <a:ext cx="2571750" cy="1381125"/>
+                          </a:xfrm>
+                          <a:prstGeom prst="rect">
+                            <a:avLst/>
+                          </a:prstGeom>
+                          <a:noFill/>
+                          <a:ln>
+                            <a:solidFill>
+                              <a:srgbClr val="BFBFBF"/>
+                            </a:solidFill>
+                          </a:ln>
+                        </pic:spPr>
+                      </pic:pic>
+                    </a:graphicData>
+                  </a:graphic>
+                </wp:inline>
+              </w:drawing>
+            </w:r>
+          </w:p>
+          <w:p>
+            <w:pPr>
+              <w:spacing w:after="200" w:before="60"/>
+              <w:jc w:val="center"/>
+            </w:pPr>
+            <w:r>
+              <w:rPr>
+                <w:i/>
+                <w:iCs/>
+                <w:color w:val="595959"/>
+                <w:sz w:val="18"/>
+                <w:szCs w:val="18"/>
+              </w:rPr>
+              <w:t xml:space="preserve">Kuva 5. Työkalupakki projektin Toolboxes-listalla.</w:t>
+            </w:r>
+          </w:p>
+        </w:tc>
+        <w:tc>
+          <w:tcPr>
+            <w:tcW w:type="dxa" w:w="4819"/>
+            <w:tcBorders>
+              <w:top w:val="none" w:color="FFFFFF" w:sz="0"/>
+              <w:left w:val="none" w:color="FFFFFF" w:sz="0"/>
+              <w:bottom w:val="none" w:color="FFFFFF" w:sz="0"/>
+              <w:right w:val="none" w:color="FFFFFF" w:sz="0"/>
+            </w:tcBorders>
+          </w:tcPr>
+          <w:p>
+            <w:pPr>
+              <w:jc w:val="center"/>
+            </w:pPr>
+            <w:r>
+              <w:drawing>
+                <wp:inline distT="0" distB="0" distL="0" distR="0">
+                  <wp:extent cx="2571750" cy="2095500"/>
+                  <wp:effectExtent t="19050" r="19050" b="19050" l="19050"/>
+                  <wp:docPr id="6" name="arc_basemap.png" descr="Taustakartat (MML/Kapsi), MML-tila." title="Taustakartat (MML/Kapsi), MML-tila."/>
+                  <wp:cNvGraphicFramePr>
+                    <a:graphicFrameLocks xmlns:a="http://schemas.openxmlformats.org/drawingml/2006/main" noChangeAspect="1"/>
+                  </wp:cNvGraphicFramePr>
+                  <a:graphic xmlns:a="http://schemas.openxmlformats.org/drawingml/2006/main">
+                    <a:graphicData uri="http://schemas.openxmlformats.org/drawingml/2006/picture">
+                      <pic:pic xmlns:pic="http://schemas.openxmlformats.org/drawingml/2006/picture">
+                        <pic:nvPicPr>
+                          <pic:cNvPr id="0" name="" descr=""/>
+                          <pic:cNvPicPr>
+                            <a:picLocks noChangeAspect="1" noChangeArrowheads="1"/>
+                          </pic:cNvPicPr>
+                        </pic:nvPicPr>
+                        <pic:blipFill>
+                          <a:blip r:embed="rId13" cstate="none"/>
+                          <a:srcRect/>
+                          <a:stretch>
+                            <a:fillRect/>
+                          </a:stretch>
+                        </pic:blipFill>
+                        <pic:spPr bwMode="auto">
+                          <a:xfrm>
+                            <a:off x="0" y="0"/>
+                            <a:ext cx="2571750" cy="2095500"/>
+                          </a:xfrm>
+                          <a:prstGeom prst="rect">
+                            <a:avLst/>
+                          </a:prstGeom>
+                          <a:noFill/>
+                          <a:ln>
+                            <a:solidFill>
+                              <a:srgbClr val="BFBFBF"/>
+                            </a:solidFill>
+                          </a:ln>
+                        </pic:spPr>
+                      </pic:pic>
+                    </a:graphicData>
+                  </a:graphic>
+                </wp:inline>
+              </w:drawing>
+            </w:r>
+          </w:p>
+          <w:p>
+            <w:pPr>
+              <w:spacing w:after="200" w:before="60"/>
+              <w:jc w:val="center"/>
+            </w:pPr>
+            <w:r>
+              <w:rPr>
+                <w:i/>
+                <w:iCs/>
+                <w:color w:val="595959"/>
+                <w:sz w:val="18"/>
+                <w:szCs w:val="18"/>
+              </w:rPr>
+              <w:t xml:space="preserve">Kuva 6. Taustakartat (MML/Kapsi), MML-tila.</w:t>
+            </w:r>
+          </w:p>
+        </w:tc>
+      </w:tr>
+    </w:tbl>
+    <w:p>
+      <w:pPr>
+        <w:spacing w:after="120"/>
+      </w:pPr>
+      <w:r>
+        <w:rPr>
+          <w:b/>
+          <w:bCs/>
+        </w:rPr>
+        <w:t xml:space="preserve">MML, live-taustakartta:</w:t>
+      </w:r>
+      <w:r>
+        <w:t xml:space="preserve"> Valitse Taustakarttapalvelu </w:t>
+      </w:r>
+      <w:r>
+        <w:rPr>
+          <w:b/>
+          <w:bCs/>
+        </w:rPr>
+        <w:t xml:space="preserve">MML</w:t>
+      </w:r>
+      <w:r>
+        <w:t xml:space="preserve"> ja anna MML API-avain. Valitse sitten Taustakartta, Maastokartta tai Kiinteistöjaotus ja paina </w:t>
+      </w:r>
+      <w:r>
+        <w:rPr>
+          <w:b/>
+          <w:bCs/>
+        </w:rPr>
+        <w:t xml:space="preserve">Run</w:t>
+      </w:r>
+      <w:r>
+        <w:t xml:space="preserve">. Taso lisätään karttaan live-vektoritiilinä ja se päivittyy karttanäkymän mukaan. Rajausta tai tallennuskohdetta ei tarvita.</w:t>
+      </w:r>
+    </w:p>
+    <w:p>
+      <w:pPr>
+        <w:spacing w:after="120"/>
+      </w:pPr>
+      <w:r>
+        <w:rPr>
+          <w:b/>
+          <w:bCs/>
+        </w:rPr>
+        <w:t xml:space="preserve">Kapsi, rasterilataus:</w:t>
+      </w:r>
+      <w:r>
+        <w:t xml:space="preserve"> Valitse </w:t>
+      </w:r>
+      <w:r>
+        <w:rPr>
+          <w:b/>
+          <w:bCs/>
+        </w:rPr>
+        <w:t xml:space="preserve">Kapsi</w:t>
+      </w:r>
+      <w:r>
+        <w:t xml:space="preserve"> ja karttataso. Valitse sitten aluerajaus ja tallennuskohde ja paina </w:t>
+      </w:r>
+      <w:r>
+        <w:rPr>
+          <w:b/>
+          <w:bCs/>
+        </w:rPr>
+        <w:t xml:space="preserve">Run</w:t>
+      </w:r>
+      <w:r>
+        <w:t xml:space="preserve">. Työkalu lataa alueen JPEG-laatat, yhdistää ne yhdeksi rasteriksi ja lisää sen karttaan.</w:t>
+      </w:r>
+    </w:p>
+    <w:p>
+      <w:pPr>
+        <w:pStyle w:val="Heading1"/>
+        <w:pageBreakBefore/>
+      </w:pPr>
+      <w:r>
+        <w:t xml:space="preserve">2  QGIS</w:t>
+      </w:r>
+    </w:p>
+    <w:p>
+      <w:pPr>
+        <w:pStyle w:val="Heading2"/>
+        <w:keepNext/>
+      </w:pPr>
+      <w:r>
+        <w:t xml:space="preserve">2.1  Asennus (suositus: Windows-asennuspaketti)</w:t>
+      </w:r>
+    </w:p>
+    <w:p>
+      <w:pPr>
+        <w:pStyle w:val="ListParagraph"/>
+        <w:numPr>
+          <w:ilvl w:val="0"/>
+          <w:numId w:val="6"/>
+        </w:numPr>
+        <w:spacing w:after="80"/>
+      </w:pPr>
+      <w:r>
+        <w:rPr>
+          <w:b/>
+          <w:bCs/>
+        </w:rPr>
+        <w:t xml:space="preserve">Sulje QGIS</w:t>
+      </w:r>
+      <w:r>
+        <w:t xml:space="preserve"> (kaikki ikkunat).</w:t>
+      </w:r>
+    </w:p>
+    <w:p>
+      <w:pPr>
+        <w:pStyle w:val="ListParagraph"/>
+        <w:numPr>
+          <w:ilvl w:val="0"/>
+          <w:numId w:val="6"/>
+        </w:numPr>
+        <w:spacing w:after="80"/>
+      </w:pPr>
+      <w:r>
+        <w:t xml:space="preserve">Napsauta </w:t>
+      </w:r>
+      <w:r>
+        <w:rPr>
+          <w:b/>
+          <w:bCs/>
+        </w:rPr>
+        <w:t xml:space="preserve">Suomenvaylat-QGIS-0.2.9-Windows.zip</w:t>
+      </w:r>
+      <w:r>
+        <w:t xml:space="preserve">-tiedostoa hiiren oikealla ja valitse </w:t>
+      </w:r>
+      <w:r>
+        <w:rPr>
+          <w:b/>
+          <w:bCs/>
+        </w:rPr>
+        <w:t xml:space="preserve">Pura kaikki</w:t>
+      </w:r>
+      <w:r>
+        <w:t xml:space="preserve">. Asennusta ei voi ajaa suoraan ZIP-paketin sisältä.</w:t>
+      </w:r>
+    </w:p>
+    <w:p>
+      <w:pPr>
+        <w:pStyle w:val="ListParagraph"/>
+        <w:numPr>
+          <w:ilvl w:val="0"/>
+          <w:numId w:val="6"/>
+        </w:numPr>
+        <w:spacing w:after="80"/>
+      </w:pPr>
+      <w:r>
+        <w:t xml:space="preserve">Avaa purettu kansio ja kaksoisnapsauta </w:t>
+      </w:r>
+      <w:r>
+        <w:rPr>
+          <w:b/>
+          <w:bCs/>
+        </w:rPr>
+        <w:t xml:space="preserve">install_windows.bat</w:t>
+      </w:r>
+      <w:r>
+        <w:t xml:space="preserve">.</w:t>
+      </w:r>
+    </w:p>
+    <w:p>
+      <w:pPr>
+        <w:pStyle w:val="ListParagraph"/>
+        <w:numPr>
+          <w:ilvl w:val="0"/>
+          <w:numId w:val="6"/>
+        </w:numPr>
+        <w:spacing w:after="80"/>
+      </w:pPr>
+      <w:r>
+        <w:t xml:space="preserve">Asennusikkunassa näkyy </w:t>
+      </w:r>
+      <w:r>
+        <w:rPr>
+          <w:b/>
+          <w:bCs/>
+        </w:rPr>
+        <w:t xml:space="preserve">Asennettu profiiliin: …</w:t>
+      </w:r>
+      <w:r>
+        <w:t xml:space="preserve"> (esim. default) ja </w:t>
+      </w:r>
+      <w:r>
+        <w:rPr>
+          <w:b/>
+          <w:bCs/>
+        </w:rPr>
+        <w:t xml:space="preserve">Valmis</w:t>
+      </w:r>
+      <w:r>
+        <w:t xml:space="preserve">. Sulje ikkuna painamalla mitä tahansa näppäintä.</w:t>
+      </w:r>
+    </w:p>
+    <w:p>
+      <w:pPr>
+        <w:pStyle w:val="ListParagraph"/>
+        <w:numPr>
+          <w:ilvl w:val="0"/>
+          <w:numId w:val="6"/>
+        </w:numPr>
+        <w:spacing w:after="80"/>
+      </w:pPr>
+      <w:r>
+        <w:t xml:space="preserve">Käynnistä QGIS. Suomenväylät-kuvake näkyy työkalupalkissa ja valikossa </w:t>
+      </w:r>
+      <w:r>
+        <w:rPr>
+          <w:b/>
+          <w:bCs/>
+        </w:rPr>
+        <w:t xml:space="preserve">Lisäosat (Plugins) → Suomenväylät</w:t>
+      </w:r>
+      <w:r>
+        <w:t xml:space="preserve">.</w:t>
+      </w:r>
+    </w:p>
+    <w:p>
+      <w:pPr>
+        <w:keepNext/>
+        <w:spacing w:before="120"/>
+        <w:jc w:val="center"/>
+      </w:pPr>
+      <w:r>
+        <w:drawing>
+          <wp:inline distT="0" distB="0" distL="0" distR="0">
+            <wp:extent cx="4476750" cy="1123950"/>
+            <wp:effectExtent t="19050" r="19050" b="19050" l="19050"/>
+            <wp:docPr id="7" name="qgis_menu.png" descr="Suomenväylät QGISin Plugins-valikossa. Sama kuvake on työkalupalkissa." title="Suomenväylät QGISin Plugins-valikossa. Sama kuvake on työkalupalkissa."/>
+            <wp:cNvGraphicFramePr>
+              <a:graphicFrameLocks xmlns:a="http://schemas.openxmlformats.org/drawingml/2006/main" noChangeAspect="1"/>
+            </wp:cNvGraphicFramePr>
+            <a:graphic xmlns:a="http://schemas.openxmlformats.org/drawingml/2006/main">
+              <a:graphicData uri="http://schemas.openxmlformats.org/drawingml/2006/picture">
+                <pic:pic xmlns:pic="http://schemas.openxmlformats.org/drawingml/2006/picture">
+                  <pic:nvPicPr>
+                    <pic:cNvPr id="0" name="" descr=""/>
+                    <pic:cNvPicPr>
+                      <a:picLocks noChangeAspect="1" noChangeArrowheads="1"/>
+                    </pic:cNvPicPr>
+                  </pic:nvPicPr>
+                  <pic:blipFill>
+                    <a:blip r:embed="rId14" cstate="none"/>
+                    <a:srcRect/>
+                    <a:stretch>
+                      <a:fillRect/>
+                    </a:stretch>
+                  </pic:blipFill>
+                  <pic:spPr bwMode="auto">
+                    <a:xfrm>
+                      <a:off x="0" y="0"/>
+                      <a:ext cx="4476750" cy="1123950"/>
+                    </a:xfrm>
+                    <a:prstGeom prst="rect">
+                      <a:avLst/>
+                    </a:prstGeom>
+                    <a:noFill/>
+                    <a:ln>
+                      <a:solidFill>
+                        <a:srgbClr val="BFBFBF"/>
+                      </a:solidFill>
+                    </a:ln>
+                  </pic:spPr>
+                </pic:pic>
+              </a:graphicData>
+            </a:graphic>
+          </wp:inline>
+        </w:drawing>
+      </w:r>
+    </w:p>
+    <w:p>
+      <w:pPr>
+        <w:spacing w:after="200" w:before="60"/>
+        <w:jc w:val="center"/>
+      </w:pPr>
+      <w:r>
+        <w:rPr>
+          <w:i/>
+          <w:iCs/>
+          <w:color w:val="595959"/>
+          <w:sz w:val="18"/>
+          <w:szCs w:val="18"/>
+        </w:rPr>
+        <w:t xml:space="preserve">Kuva 7. Suomenväylät QGISin Plugins-valikossa. Sama kuvake on työkalupalkissa.</w:t>
+      </w:r>
+    </w:p>
+    <w:p>
+      <w:pPr>
+        <w:pBdr>
+          <w:left w:val="single" w:color="1F4E79" w:sz="18" w:space="8"/>
+        </w:pBdr>
+        <w:shd w:fill="EAF1F8" w:color="auto" w:val="clear"/>
+        <w:spacing w:after="180" w:before="120"/>
+        <w:ind w:left="170" w:right="170"/>
+      </w:pPr>
+      <w:r>
+        <w:rPr>
+          <w:b/>
+          <w:bCs/>
+          <w:color w:val="1F4E79"/>
+        </w:rPr>
+        <w:t xml:space="preserve">Jos Windows varoittaa </w:t>
+      </w:r>
+      <w:r>
+        <w:t xml:space="preserve">tuntemattomasta sovelluksesta (SmartScreen), valitse </w:t>
+      </w:r>
+      <w:r>
+        <w:rPr>
+          <w:b/>
+          <w:bCs/>
+        </w:rPr>
+        <w:t xml:space="preserve">Lisätietoja → Suorita silti</w:t>
+      </w:r>
+      <w:r>
+        <w:t xml:space="preserve">. Asennin kopioi lisäosan käyttäjän QGIS-profiileihin ja ottaa sen käyttöön. Järjestelmänvalvojan oikeuksia ei tarvita.</w:t>
+      </w:r>
+    </w:p>
+    <w:p>
+      <w:pPr>
+        <w:spacing w:after="120"/>
+      </w:pPr>
+      <w:r>
+        <w:rPr>
+          <w:b/>
+          <w:bCs/>
+        </w:rPr>
+        <w:t xml:space="preserve">Vaihtoehto: asennus QGISissä.</w:t>
+      </w:r>
+      <w:r>
+        <w:t xml:space="preserve"> Valitse </w:t>
+      </w:r>
+      <w:r>
+        <w:rPr>
+          <w:b/>
+          <w:bCs/>
+        </w:rPr>
+        <w:t xml:space="preserve">Lisäosat → Hallitse ja asenna lisäosia → Asenna ZIP-tiedostosta</w:t>
+      </w:r>
+      <w:r>
+        <w:t xml:space="preserve"> (englanninkielisessä QGISissä Plugins → Manage and Install Plugins → Install from ZIP). Valitse tiedosto </w:t>
+      </w:r>
+      <w:r>
+        <w:rPr>
+          <w:b/>
+          <w:bCs/>
+        </w:rPr>
+        <w:t xml:space="preserve">Suomenvaylat-QGIS-0.2.9.zip</w:t>
+      </w:r>
+      <w:r>
+        <w:t xml:space="preserve"> ja paina </w:t>
+      </w:r>
+      <w:r>
+        <w:rPr>
+          <w:b/>
+          <w:bCs/>
+        </w:rPr>
+        <w:t xml:space="preserve">Asenna lisäosa</w:t>
+      </w:r>
+      <w:r>
+        <w:t xml:space="preserve"> (Install Plugin). Tämä tiedosto on eri kuin Windows-paketti.</w:t>
+      </w:r>
+    </w:p>
+    <w:p>
+      <w:pPr>
+        <w:keepNext/>
+        <w:spacing w:before="120"/>
+        <w:jc w:val="center"/>
+      </w:pPr>
+      <w:r>
+        <w:drawing>
+          <wp:inline distT="0" distB="0" distL="0" distR="0">
+            <wp:extent cx="4762500" cy="1095375"/>
+            <wp:effectExtent t="19050" r="19050" b="19050" l="19050"/>
+            <wp:docPr id="8" name="qgis_zip.png" descr="Install from ZIP: valitse ZIP-tiedosto ja paina Install Plugin." title="Install from ZIP: valitse ZIP-tiedosto ja paina Install Plugin."/>
+            <wp:cNvGraphicFramePr>
+              <a:graphicFrameLocks xmlns:a="http://schemas.openxmlformats.org/drawingml/2006/main" noChangeAspect="1"/>
+            </wp:cNvGraphicFramePr>
+            <a:graphic xmlns:a="http://schemas.openxmlformats.org/drawingml/2006/main">
+              <a:graphicData uri="http://schemas.openxmlformats.org/drawingml/2006/picture">
+                <pic:pic xmlns:pic="http://schemas.openxmlformats.org/drawingml/2006/picture">
+                  <pic:nvPicPr>
+                    <pic:cNvPr id="0" name="" descr=""/>
+                    <pic:cNvPicPr>
+                      <a:picLocks noChangeAspect="1" noChangeArrowheads="1"/>
+                    </pic:cNvPicPr>
+                  </pic:nvPicPr>
+                  <pic:blipFill>
+                    <a:blip r:embed="rId15" cstate="none"/>
+                    <a:srcRect/>
+                    <a:stretch>
+                      <a:fillRect/>
+                    </a:stretch>
+                  </pic:blipFill>
+                  <pic:spPr bwMode="auto">
+                    <a:xfrm>
+                      <a:off x="0" y="0"/>
+                      <a:ext cx="4762500" cy="1095375"/>
+                    </a:xfrm>
+                    <a:prstGeom prst="rect">
+                      <a:avLst/>
+                    </a:prstGeom>
+                    <a:noFill/>
+                    <a:ln>
+                      <a:solidFill>
+                        <a:srgbClr val="BFBFBF"/>
+                      </a:solidFill>
+                    </a:ln>
+                  </pic:spPr>
+                </pic:pic>
+              </a:graphicData>
+            </a:graphic>
+          </wp:inline>
+        </w:drawing>
+      </w:r>
+    </w:p>
+    <w:p>
+      <w:pPr>
+        <w:spacing w:after="200" w:before="60"/>
+        <w:jc w:val="center"/>
+      </w:pPr>
+      <w:r>
+        <w:rPr>
+          <w:i/>
+          <w:iCs/>
+          <w:color w:val="595959"/>
+          <w:sz w:val="18"/>
+          <w:szCs w:val="18"/>
+        </w:rPr>
+        <w:t xml:space="preserve">Kuva 8. Install from ZIP: valitse ZIP-tiedosto ja paina Install Plugin.</w:t>
+      </w:r>
+    </w:p>
+    <w:p>
+      <w:pPr>
+        <w:pBdr>
+          <w:left w:val="single" w:color="1F4E79" w:sz="18" w:space="8"/>
+        </w:pBdr>
+        <w:shd w:fill="EAF1F8" w:color="auto" w:val="clear"/>
+        <w:spacing w:after="180" w:before="120"/>
+        <w:ind w:left="170" w:right="170"/>
+      </w:pPr>
+      <w:r>
+        <w:rPr>
+          <w:b/>
+          <w:bCs/>
+          <w:color w:val="1F4E79"/>
+        </w:rPr>
+        <w:t xml:space="preserve">Päivitys: </w:t>
+      </w:r>
+      <w:r>
+        <w:t xml:space="preserve">Aja uuden version install_windows.bat QGIS suljettuna. Asennin poistaa vanhan version ennen uuden kopiointia.</w:t>
+      </w:r>
+    </w:p>
+    <w:p>
+      <w:pPr>
+        <w:pStyle w:val="Heading2"/>
+        <w:keepNext/>
+      </w:pPr>
+      <w:r>
+        <w:t xml:space="preserve">2.2  Aineistojen lataus: Hae aineistoja</w:t>
+      </w:r>
+    </w:p>
+    <w:p>
+      <w:pPr>
+        <w:spacing w:after="120"/>
+      </w:pPr>
+      <w:r>
+        <w:t xml:space="preserve">Avaa Suomenväylät-ikkuna kuvakkeesta. Ikkuna etenee ylhäältä alas kolmessa numeroidussa vaiheessa.</w:t>
+      </w:r>
+    </w:p>
+    <w:p>
+      <w:pPr>
+        <w:pStyle w:val="ListParagraph"/>
+        <w:numPr>
+          <w:ilvl w:val="0"/>
+          <w:numId w:val="7"/>
+        </w:numPr>
+        <w:spacing w:after="80"/>
+      </w:pPr>
+      <w:r>
+        <w:t xml:space="preserve">Kohdassa </w:t>
+      </w:r>
+      <w:r>
+        <w:rPr>
+          <w:b/>
+          <w:bCs/>
+        </w:rPr>
+        <w:t xml:space="preserve">Valitse tietolähteet</w:t>
+      </w:r>
+      <w:r>
+        <w:t xml:space="preserve"> ruksi lähteet. Jos lähde tarvitsee tunnuksen, näkyviin tulee </w:t>
+      </w:r>
+      <w:r>
+        <w:rPr>
+          <w:b/>
+          <w:bCs/>
+        </w:rPr>
+        <w:t xml:space="preserve">Tunnukset valituille lähteille</w:t>
+      </w:r>
+      <w:r>
+        <w:t xml:space="preserve"> -kenttä.</w:t>
+      </w:r>
+    </w:p>
+    <w:p>
+      <w:pPr>
+        <w:pStyle w:val="ListParagraph"/>
+        <w:numPr>
+          <w:ilvl w:val="0"/>
+          <w:numId w:val="7"/>
+        </w:numPr>
+        <w:spacing w:after="80"/>
+      </w:pPr>
+      <w:r>
+        <w:t xml:space="preserve">Kohdassa </w:t>
+      </w:r>
+      <w:r>
+        <w:rPr>
+          <w:b/>
+          <w:bCs/>
+        </w:rPr>
+        <w:t xml:space="preserve">Hae ja valitse aineistot</w:t>
+      </w:r>
+      <w:r>
+        <w:t xml:space="preserve"> paina </w:t>
+      </w:r>
+      <w:r>
+        <w:rPr>
+          <w:b/>
+          <w:bCs/>
+        </w:rPr>
+        <w:t xml:space="preserve">Hae tasot</w:t>
+      </w:r>
+      <w:r>
+        <w:t xml:space="preserve">. Rajaa luetteloa hakukentällä ja ruksi ladattavat tasot. </w:t>
+      </w:r>
+      <w:r>
+        <w:rPr>
+          <w:b/>
+          <w:bCs/>
+        </w:rPr>
+        <w:t xml:space="preserve">Valitse näkyvät</w:t>
+      </w:r>
+      <w:r>
+        <w:t xml:space="preserve"> ruksii kaikki hakua vastaavat tasot. Valinnat säilyvät, vaikka hakusanaa vaihdetaan.</w:t>
+      </w:r>
+    </w:p>
+    <w:p>
+      <w:pPr>
+        <w:pStyle w:val="ListParagraph"/>
+        <w:numPr>
+          <w:ilvl w:val="0"/>
+          <w:numId w:val="7"/>
+        </w:numPr>
+        <w:spacing w:after="80"/>
+      </w:pPr>
+      <w:r>
+        <w:t xml:space="preserve">Kohdassa </w:t>
+      </w:r>
+      <w:r>
+        <w:rPr>
+          <w:b/>
+          <w:bCs/>
+        </w:rPr>
+        <w:t xml:space="preserve">Rajaa tiedostoon ladattavat aineistot</w:t>
+      </w:r>
+      <w:r>
+        <w:t xml:space="preserve"> valitse aluerajaus (Koko Suomi, Elinvoimakeskus, Hyvinvointialue, Maakunta, Kunta/Kaupunki tai Oma aineisto). Ruksi sitten alueet tai valitse oma polygon- tai viivataso.</w:t>
+      </w:r>
+    </w:p>
+    <w:p>
+      <w:pPr>
+        <w:pStyle w:val="ListParagraph"/>
+        <w:numPr>
+          <w:ilvl w:val="0"/>
+          <w:numId w:val="7"/>
+        </w:numPr>
+        <w:spacing w:after="80"/>
+      </w:pPr>
+      <w:r>
+        <w:rPr>
+          <w:b/>
+          <w:bCs/>
+        </w:rPr>
+        <w:t xml:space="preserve">Tallennuskansio:</w:t>
+      </w:r>
+      <w:r>
+        <w:t xml:space="preserve"> tallennetun projektin kansio täytetään automaattisesti. Tallenna siksi projekti ennen latausta tai valitse kansio </w:t>
+      </w:r>
+      <w:r>
+        <w:rPr>
+          <w:b/>
+          <w:bCs/>
+        </w:rPr>
+        <w:t xml:space="preserve">Valitse…</w:t>
+      </w:r>
+      <w:r>
+        <w:t xml:space="preserve">-painikkeella.</w:t>
+      </w:r>
+    </w:p>
+    <w:p>
+      <w:pPr>
+        <w:pStyle w:val="ListParagraph"/>
+        <w:numPr>
+          <w:ilvl w:val="0"/>
+          <w:numId w:val="7"/>
+        </w:numPr>
+        <w:spacing w:after="80"/>
+      </w:pPr>
+      <w:r>
+        <w:t xml:space="preserve">Paina </w:t>
+      </w:r>
+      <w:r>
+        <w:rPr>
+          <w:b/>
+          <w:bCs/>
+        </w:rPr>
+        <w:t xml:space="preserve">Lataa valitut aineistot</w:t>
+      </w:r>
+      <w:r>
+        <w:t xml:space="preserve">. Lataus toimii taustalla, joten QGISiä voi käyttää sillä aikaa. </w:t>
+      </w:r>
+      <w:r>
+        <w:rPr>
+          <w:b/>
+          <w:bCs/>
+        </w:rPr>
+        <w:t xml:space="preserve">Keskeytä</w:t>
+      </w:r>
+      <w:r>
+        <w:t xml:space="preserve"> pysäyttää latauksen.</w:t>
+      </w:r>
+    </w:p>
+    <w:p>
+      <w:pPr>
+        <w:keepNext/>
+        <w:spacing w:before="120"/>
+        <w:jc w:val="center"/>
+      </w:pPr>
+      <w:r>
+        <w:drawing>
+          <wp:inline distT="0" distB="0" distL="0" distR="0">
+            <wp:extent cx="4476750" cy="4914900"/>
+            <wp:effectExtent t="19050" r="19050" b="19050" l="19050"/>
+            <wp:docPr id="9" name="qgis_02_data_filled.png" descr="Hae aineistoja: Väylän ja DigiRoadin nopeusrajoitukset rajattuna Tampereelle." title="Hae aineistoja: Väylän ja DigiRoadin nopeusrajoitukset rajattuna Tampereelle."/>
+            <wp:cNvGraphicFramePr>
+              <a:graphicFrameLocks xmlns:a="http://schemas.openxmlformats.org/drawingml/2006/main" noChangeAspect="1"/>
+            </wp:cNvGraphicFramePr>
+            <a:graphic xmlns:a="http://schemas.openxmlformats.org/drawingml/2006/main">
+              <a:graphicData uri="http://schemas.openxmlformats.org/drawingml/2006/picture">
+                <pic:pic xmlns:pic="http://schemas.openxmlformats.org/drawingml/2006/picture">
+                  <pic:nvPicPr>
+                    <pic:cNvPr id="0" name="" descr=""/>
+                    <pic:cNvPicPr>
+                      <a:picLocks noChangeAspect="1" noChangeArrowheads="1"/>
+                    </pic:cNvPicPr>
+                  </pic:nvPicPr>
+                  <pic:blipFill>
+                    <a:blip r:embed="rId16" cstate="none"/>
+                    <a:srcRect/>
+                    <a:stretch>
+                      <a:fillRect/>
+                    </a:stretch>
+                  </pic:blipFill>
+                  <pic:spPr bwMode="auto">
+                    <a:xfrm>
+                      <a:off x="0" y="0"/>
+                      <a:ext cx="4476750" cy="4914900"/>
+                    </a:xfrm>
+                    <a:prstGeom prst="rect">
+                      <a:avLst/>
+                    </a:prstGeom>
+                    <a:noFill/>
+                    <a:ln>
+                      <a:solidFill>
+                        <a:srgbClr val="BFBFBF"/>
+                      </a:solidFill>
+                    </a:ln>
+                  </pic:spPr>
+                </pic:pic>
+              </a:graphicData>
+            </a:graphic>
+          </wp:inline>
+        </w:drawing>
+      </w:r>
+    </w:p>
+    <w:p>
+      <w:pPr>
+        <w:spacing w:after="200" w:before="60"/>
+        <w:jc w:val="center"/>
+      </w:pPr>
+      <w:r>
+        <w:rPr>
+          <w:i/>
+          <w:iCs/>
+          <w:color w:val="595959"/>
+          <w:sz w:val="18"/>
+          <w:szCs w:val="18"/>
+        </w:rPr>
+        <w:t xml:space="preserve">Kuva 9. Hae aineistoja: Väylän ja DigiRoadin nopeusrajoitukset rajattuna Tampereelle.</w:t>
+      </w:r>
+    </w:p>
+    <w:p>
+      <w:pPr>
+        <w:keepNext/>
+        <w:spacing w:before="120"/>
+        <w:jc w:val="center"/>
+      </w:pPr>
+      <w:r>
+        <w:drawing>
+          <wp:inline distT="0" distB="0" distL="0" distR="0">
+            <wp:extent cx="4095750" cy="1847850"/>
+            <wp:effectExtent t="19050" r="19050" b="19050" l="19050"/>
+            <wp:docPr id="10" name="qgis_01b_credentials_crop.png" descr="Tunnuskenttä näkyy vain, kun valittu lähde (tässä MML) tarvitsee avaimen." title="Tunnuskenttä näkyy vain, kun valittu lähde (tässä MML) tarvitsee avaimen."/>
+            <wp:cNvGraphicFramePr>
+              <a:graphicFrameLocks xmlns:a="http://schemas.openxmlformats.org/drawingml/2006/main" noChangeAspect="1"/>
+            </wp:cNvGraphicFramePr>
+            <a:graphic xmlns:a="http://schemas.openxmlformats.org/drawingml/2006/main">
+              <a:graphicData uri="http://schemas.openxmlformats.org/drawingml/2006/picture">
+                <pic:pic xmlns:pic="http://schemas.openxmlformats.org/drawingml/2006/picture">
+                  <pic:nvPicPr>
+                    <pic:cNvPr id="0" name="" descr=""/>
+                    <pic:cNvPicPr>
+                      <a:picLocks noChangeAspect="1" noChangeArrowheads="1"/>
+                    </pic:cNvPicPr>
+                  </pic:nvPicPr>
+                  <pic:blipFill>
+                    <a:blip r:embed="rId17" cstate="none"/>
+                    <a:srcRect/>
+                    <a:stretch>
+                      <a:fillRect/>
+                    </a:stretch>
+                  </pic:blipFill>
+                  <pic:spPr bwMode="auto">
+                    <a:xfrm>
+                      <a:off x="0" y="0"/>
+                      <a:ext cx="4095750" cy="1847850"/>
+                    </a:xfrm>
+                    <a:prstGeom prst="rect">
+                      <a:avLst/>
+                    </a:prstGeom>
+                    <a:noFill/>
+                    <a:ln>
+                      <a:solidFill>
+                        <a:srgbClr val="BFBFBF"/>
+                      </a:solidFill>
+                    </a:ln>
+                  </pic:spPr>
+                </pic:pic>
+              </a:graphicData>
+            </a:graphic>
+          </wp:inline>
+        </w:drawing>
+      </w:r>
+    </w:p>
+    <w:p>
+      <w:pPr>
+        <w:spacing w:after="200" w:before="60"/>
+        <w:jc w:val="center"/>
+      </w:pPr>
+      <w:r>
+        <w:rPr>
+          <w:i/>
+          <w:iCs/>
+          <w:color w:val="595959"/>
+          <w:sz w:val="18"/>
+          <w:szCs w:val="18"/>
+        </w:rPr>
+        <w:t xml:space="preserve">Kuva 10. Tunnuskenttä näkyy vain, kun valittu lähde (tässä MML) tarvitsee avaimen.</w:t>
+      </w:r>
+    </w:p>
+    <w:p>
+      <w:pPr>
+        <w:spacing w:after="120"/>
+      </w:pPr>
+      <w:r>
+        <w:t xml:space="preserve">Aineistot tallennetaan GeoPackage-tiedostoiksi koordinaatistossa </w:t>
+      </w:r>
+      <w:r>
+        <w:rPr>
+          <w:b/>
+          <w:bCs/>
+        </w:rPr>
+        <w:t xml:space="preserve">EPSG:3067</w:t>
+      </w:r>
+      <w:r>
+        <w:t xml:space="preserve"> (ETRS-TM35FIN) ja lisätään projektiin. Jos projektilla ei ole koordinaattijärjestelmää, lisäosa asettaa sen ensimmäisen ladatun tason mukaan.</w:t>
+      </w:r>
+    </w:p>
+    <w:p>
+      <w:pPr>
+        <w:pBdr>
+          <w:left w:val="single" w:color="1F4E79" w:sz="18" w:space="8"/>
+        </w:pBdr>
+        <w:shd w:fill="EAF1F8" w:color="auto" w:val="clear"/>
+        <w:spacing w:after="180" w:before="120"/>
+        <w:ind w:left="170" w:right="170"/>
+      </w:pPr>
+      <w:r>
+        <w:rPr>
+          <w:b/>
+          <w:bCs/>
+          <w:color w:val="1F4E79"/>
+        </w:rPr>
+        <w:t xml:space="preserve">Hyvä tietää: </w:t>
+      </w:r>
+      <w:r>
+        <w:t xml:space="preserve">Väylän, DigiRoadin ja Tilastokeskuksen kohteet tallennetaan kokonaisina, jos ne osuvat rajaukseen. Muiden lähteiden aineistot leikataan rajauksen muotoon. Live-karttatasoille (esim. Aino WMS ja MML Karttakuva) ei tarvita rajausta eikä tallennuskansiota.</w:t>
+      </w:r>
+    </w:p>
+    <w:p>
+      <w:pPr>
+        <w:pStyle w:val="Heading2"/>
+        <w:keepNext/>
+      </w:pPr>
+      <w:r>
+        <w:t xml:space="preserve">2.3  Taustakartta: Lisää taustakartta</w:t>
+      </w:r>
+    </w:p>
+    <w:p>
+      <w:pPr>
+        <w:keepNext/>
+        <w:spacing w:before="120"/>
+        <w:jc w:val="center"/>
+      </w:pPr>
+      <w:r>
+        <w:drawing>
+          <wp:inline distT="0" distB="0" distL="0" distR="0">
+            <wp:extent cx="4476750" cy="1095375"/>
+            <wp:effectExtent t="19050" r="19050" b="19050" l="19050"/>
+            <wp:docPr id="11" name="qgis_03_background_crop.png" descr="Lisää taustakartta -välilehti." title="Lisää taustakartta -välilehti."/>
+            <wp:cNvGraphicFramePr>
+              <a:graphicFrameLocks xmlns:a="http://schemas.openxmlformats.org/drawingml/2006/main" noChangeAspect="1"/>
+            </wp:cNvGraphicFramePr>
+            <a:graphic xmlns:a="http://schemas.openxmlformats.org/drawingml/2006/main">
+              <a:graphicData uri="http://schemas.openxmlformats.org/drawingml/2006/picture">
+                <pic:pic xmlns:pic="http://schemas.openxmlformats.org/drawingml/2006/picture">
+                  <pic:nvPicPr>
+                    <pic:cNvPr id="0" name="" descr=""/>
+                    <pic:cNvPicPr>
+                      <a:picLocks noChangeAspect="1" noChangeArrowheads="1"/>
+                    </pic:cNvPicPr>
+                  </pic:nvPicPr>
+                  <pic:blipFill>
+                    <a:blip r:embed="rId18" cstate="none"/>
+                    <a:srcRect/>
+                    <a:stretch>
+                      <a:fillRect/>
+                    </a:stretch>
+                  </pic:blipFill>
+                  <pic:spPr bwMode="auto">
+                    <a:xfrm>
+                      <a:off x="0" y="0"/>
+                      <a:ext cx="4476750" cy="1095375"/>
+                    </a:xfrm>
+                    <a:prstGeom prst="rect">
+                      <a:avLst/>
+                    </a:prstGeom>
+                    <a:noFill/>
+                    <a:ln>
+                      <a:solidFill>
+                        <a:srgbClr val="BFBFBF"/>
+                      </a:solidFill>
+                    </a:ln>
+                  </pic:spPr>
+                </pic:pic>
+              </a:graphicData>
+            </a:graphic>
+          </wp:inline>
+        </w:drawing>
+      </w:r>
+    </w:p>
+    <w:p>
+      <w:pPr>
+        <w:spacing w:after="200" w:before="60"/>
+        <w:jc w:val="center"/>
+      </w:pPr>
+      <w:r>
+        <w:rPr>
+          <w:i/>
+          <w:iCs/>
+          <w:color w:val="595959"/>
+          <w:sz w:val="18"/>
+          <w:szCs w:val="18"/>
+        </w:rPr>
+        <w:t xml:space="preserve">Kuva 11. Lisää taustakartta -välilehti.</w:t>
       </w:r>
     </w:p>
     <w:p>
@@ -3464,7 +4094,7 @@
           </w:tcPr>
           <w:p>
             <w:r>
-              <w:t xml:space="preserve">Tarkista Project → Add-In Manager, että lisäosa on listalla. Jos se on estetty, salli se kohdassa Options (esim. Load all Add-Ins without restrictions) ja käynnistä ArcGIS Pro uudelleen.</w:t>
+              <w:t xml:space="preserve">Tarkista Project → Add-In Manager, että suomenvaylat on listalla. Jos se on estetty, salli lisäosat Add-In Managerin Options-välilehdellä ja käynnistä ArcGIS Pro uudelleen.</w:t>
             </w:r>
           </w:p>
         </w:tc>
@@ -3688,7 +4318,7 @@
           </w:tcPr>
           <w:p>
             <w:r>
-              <w:t xml:space="preserve">Valitse Lisäosat → Hallitse ja asenna lisäosia → Asennetut ja ruksi Suomenväylät. Tarkista, että QGIS on versiota 3.44 tai uudempi.</w:t>
+              <w:t xml:space="preserve">Valitse Lisäosat (Plugins) → Hallitse ja asenna lisäosia → Asennetut (Installed) ja ruksi Suomenväylät. Tarkista, että QGIS on versiota 3.44 tai uudempi.</w:t>
             </w:r>
           </w:p>
         </w:tc>

</xml_diff>